<commit_message>
Generalise employer references in published CV; fix link-check coverage
Replace the internal system and department names in the published CV with
a generalised description of the same work. The claim is unchanged - same
role, same scope, same numbers - but the CV no longer carries internal
naming into external applications.

Applied across all three published artifacts (.md, .docx, .pdf), verified
to agree on every factual string: the 635-test / 98.10% coverage figures,
the IBM response-time result, and both publication links.

Also:
- check-links.mjs skipped every URL containing arjunganesh.dev, so the
  bastion.arjunganesh.dev demo was never actually checked. Skip only the
  apex domain so separately hosted subdomains are covered.
- Run CI weekly, so a demo link that dies between pushes is caught.
- Ignore Office lock files.
</commit_message>
<xml_diff>
--- a/public/AG_CV.docx
+++ b/public/AG_CV.docx
@@ -299,20 +299,9 @@
       <w:r>
         <w:rPr>
           <w:rFonts w:ascii="Calibri" w:hAnsi="Calibri" w:cs="Calibri"/>
+          <w:lang w:val="en-SE"/>
         </w:rPr>
-        <w:t xml:space="preserve">Senior software and AI engineer with 14+ years delivering production systems across regulated banking, media and cloud platforms. Designs and builds systems from discovery and architecture through implementation, deployment and operational support. Current work includes KIRA Copilot, a production AI application used daily by Economic Crime Prevention analysts, alongside a Java/Spring Boot integration platform, internal developer tooling and cross-team enablement. Hands-on across Python, Java, TypeScript, APIs, distributed systems, Kubernetes, Azure, AWS and Google Cloud, with applied depth in retrieval, agentic orchestration, evaluation and responsible AI. Won Hack for Good, one of three winners, at the Microsoft Agents League </w:t>
-      </w:r>
-      <w:r>
-        <w:rPr>
-          <w:rFonts w:ascii="Calibri" w:hAnsi="Calibri" w:cs="Calibri"/>
-        </w:rPr>
-        <w:t>-</w:t>
-      </w:r>
-      <w:r>
-        <w:rPr>
-          <w:rFonts w:ascii="Calibri" w:hAnsi="Calibri" w:cs="Calibri"/>
-        </w:rPr>
-        <w:t xml:space="preserve"> AI Skills Fest 2026 with ARGUS, and authored a Microsoft Tech Community guest article explaining its architecture.</w:t>
+        <w:t>Senior software and AI engineer with 14+ years delivering production systems across regulated banking, media and cloud platforms. Designs and builds systems from discovery and architecture through implementation, deployment and operational support. Current work includes a production AI application used daily by financial-crime analysts, alongside a Java/Spring Boot integration platform, internal developer tooling and cross-team enablement. Hands-on across Python, Java, TypeScript, APIs, distributed systems, Kubernetes, Azure, AWS and Google Cloud, with applied depth in retrieval, agentic orchestration, evaluation and responsible AI. Won Hack for Good, one of three winners, at the Microsoft Agents League - AI Skills Fest 2026 with ARGUS, and authored a Microsoft Tech Community guest article explaining its architecture.</w:t>
       </w:r>
     </w:p>
     <w:p>
@@ -341,7 +330,7 @@
     </w:p>
     <w:p>
       <w:pPr>
-        <w:spacing w:before="0" w:after="80"/>
+        <w:spacing w:before="0" w:after="0"/>
         <w:contextualSpacing/>
         <w:mirrorIndents/>
         <w:jc w:val="both"/>
@@ -369,7 +358,7 @@
     </w:p>
     <w:p>
       <w:pPr>
-        <w:spacing w:before="0" w:after="80"/>
+        <w:spacing w:before="0" w:after="0"/>
         <w:contextualSpacing/>
         <w:mirrorIndents/>
         <w:jc w:val="both"/>
@@ -397,7 +386,7 @@
     </w:p>
     <w:p>
       <w:pPr>
-        <w:spacing w:before="0" w:after="80"/>
+        <w:spacing w:before="0" w:after="0"/>
         <w:contextualSpacing/>
         <w:mirrorIndents/>
         <w:jc w:val="both"/>
@@ -425,7 +414,7 @@
     </w:p>
     <w:p>
       <w:pPr>
-        <w:spacing w:before="0" w:after="80"/>
+        <w:spacing w:before="0" w:after="0"/>
         <w:contextualSpacing/>
         <w:mirrorIndents/>
         <w:jc w:val="both"/>
@@ -453,7 +442,7 @@
     </w:p>
     <w:p>
       <w:pPr>
-        <w:spacing w:before="0" w:after="80"/>
+        <w:spacing w:before="0" w:after="0"/>
         <w:contextualSpacing/>
         <w:mirrorIndents/>
         <w:jc w:val="both"/>
@@ -573,7 +562,7 @@
       <w:pPr>
         <w:numPr>
           <w:ilvl w:val="0"/>
-          <w:numId w:val="159"/>
+          <w:numId w:val="168"/>
         </w:numPr>
         <w:tabs>
           <w:tab w:val="num" w:pos="720"/>
@@ -591,14 +580,14 @@
           <w:rFonts w:ascii="Calibri" w:hAnsi="Calibri" w:cs="Calibri"/>
           <w:lang w:val="en-SE"/>
         </w:rPr>
-        <w:t>Architected and built KIRA Copilot, a production AI application used daily by Economic Crime Prevention analysts, translating a regulated investigation workflow into ingestion, retrieval, orchestration and an analyst-facing experience.</w:t>
+        <w:t>Architected and built a production AI application used daily by financial-crime analysts, translating a regulated investigation workflow into ingestion, retrieval, orchestration and an analyst-facing experience.</w:t>
       </w:r>
     </w:p>
     <w:p>
       <w:pPr>
         <w:numPr>
           <w:ilvl w:val="0"/>
-          <w:numId w:val="159"/>
+          <w:numId w:val="168"/>
         </w:numPr>
         <w:tabs>
           <w:tab w:val="num" w:pos="720"/>
@@ -623,7 +612,7 @@
       <w:pPr>
         <w:numPr>
           <w:ilvl w:val="0"/>
-          <w:numId w:val="159"/>
+          <w:numId w:val="168"/>
         </w:numPr>
         <w:tabs>
           <w:tab w:val="num" w:pos="720"/>
@@ -648,7 +637,7 @@
       <w:pPr>
         <w:numPr>
           <w:ilvl w:val="0"/>
-          <w:numId w:val="159"/>
+          <w:numId w:val="168"/>
         </w:numPr>
         <w:tabs>
           <w:tab w:val="num" w:pos="720"/>
@@ -673,7 +662,7 @@
       <w:pPr>
         <w:numPr>
           <w:ilvl w:val="0"/>
-          <w:numId w:val="159"/>
+          <w:numId w:val="168"/>
         </w:numPr>
         <w:tabs>
           <w:tab w:val="num" w:pos="720"/>
@@ -698,7 +687,7 @@
       <w:pPr>
         <w:numPr>
           <w:ilvl w:val="0"/>
-          <w:numId w:val="159"/>
+          <w:numId w:val="168"/>
         </w:numPr>
         <w:tabs>
           <w:tab w:val="num" w:pos="720"/>
@@ -1012,7 +1001,7 @@
       <w:pPr>
         <w:numPr>
           <w:ilvl w:val="0"/>
-          <w:numId w:val="161"/>
+          <w:numId w:val="169"/>
         </w:numPr>
         <w:spacing w:before="0" w:after="20"/>
         <w:mirrorIndents/>
@@ -1034,7 +1023,7 @@
       <w:pPr>
         <w:numPr>
           <w:ilvl w:val="0"/>
-          <w:numId w:val="161"/>
+          <w:numId w:val="169"/>
         </w:numPr>
         <w:spacing w:before="0" w:after="20"/>
         <w:mirrorIndents/>
@@ -1056,7 +1045,7 @@
       <w:pPr>
         <w:numPr>
           <w:ilvl w:val="0"/>
-          <w:numId w:val="161"/>
+          <w:numId w:val="169"/>
         </w:numPr>
         <w:spacing w:before="0" w:after="20"/>
         <w:mirrorIndents/>
@@ -1078,7 +1067,7 @@
       <w:pPr>
         <w:numPr>
           <w:ilvl w:val="0"/>
-          <w:numId w:val="161"/>
+          <w:numId w:val="169"/>
         </w:numPr>
         <w:spacing w:before="0" w:after="20"/>
         <w:mirrorIndents/>
@@ -8501,6 +8490,155 @@
     </w:lvl>
   </w:abstractNum>
   <w:abstractNum w:abstractNumId="50" w15:restartNumberingAfterBreak="0">
+    <w:nsid w:val="242B4A25"/>
+    <w:multiLevelType w:val="multilevel"/>
+    <w:tmpl w:val="5498A3D0"/>
+    <w:lvl w:ilvl="0">
+      <w:start w:val="1"/>
+      <w:numFmt w:val="bullet"/>
+      <w:lvlText w:val=""/>
+      <w:lvlJc w:val="left"/>
+      <w:pPr>
+        <w:tabs>
+          <w:tab w:val="num" w:pos="360"/>
+        </w:tabs>
+        <w:ind w:left="360" w:hanging="360"/>
+      </w:pPr>
+      <w:rPr>
+        <w:rFonts w:ascii="Symbol" w:hAnsi="Symbol" w:hint="default"/>
+        <w:sz w:val="20"/>
+      </w:rPr>
+    </w:lvl>
+    <w:lvl w:ilvl="1" w:tentative="1">
+      <w:start w:val="1"/>
+      <w:numFmt w:val="bullet"/>
+      <w:lvlText w:val="o"/>
+      <w:lvlJc w:val="left"/>
+      <w:pPr>
+        <w:tabs>
+          <w:tab w:val="num" w:pos="1080"/>
+        </w:tabs>
+        <w:ind w:left="1080" w:hanging="360"/>
+      </w:pPr>
+      <w:rPr>
+        <w:rFonts w:ascii="Courier New" w:hAnsi="Courier New" w:hint="default"/>
+        <w:sz w:val="20"/>
+      </w:rPr>
+    </w:lvl>
+    <w:lvl w:ilvl="2" w:tentative="1">
+      <w:start w:val="1"/>
+      <w:numFmt w:val="bullet"/>
+      <w:lvlText w:val=""/>
+      <w:lvlJc w:val="left"/>
+      <w:pPr>
+        <w:tabs>
+          <w:tab w:val="num" w:pos="1800"/>
+        </w:tabs>
+        <w:ind w:left="1800" w:hanging="360"/>
+      </w:pPr>
+      <w:rPr>
+        <w:rFonts w:ascii="Wingdings" w:hAnsi="Wingdings" w:hint="default"/>
+        <w:sz w:val="20"/>
+      </w:rPr>
+    </w:lvl>
+    <w:lvl w:ilvl="3" w:tentative="1">
+      <w:start w:val="1"/>
+      <w:numFmt w:val="bullet"/>
+      <w:lvlText w:val=""/>
+      <w:lvlJc w:val="left"/>
+      <w:pPr>
+        <w:tabs>
+          <w:tab w:val="num" w:pos="2520"/>
+        </w:tabs>
+        <w:ind w:left="2520" w:hanging="360"/>
+      </w:pPr>
+      <w:rPr>
+        <w:rFonts w:ascii="Wingdings" w:hAnsi="Wingdings" w:hint="default"/>
+        <w:sz w:val="20"/>
+      </w:rPr>
+    </w:lvl>
+    <w:lvl w:ilvl="4" w:tentative="1">
+      <w:start w:val="1"/>
+      <w:numFmt w:val="bullet"/>
+      <w:lvlText w:val=""/>
+      <w:lvlJc w:val="left"/>
+      <w:pPr>
+        <w:tabs>
+          <w:tab w:val="num" w:pos="3240"/>
+        </w:tabs>
+        <w:ind w:left="3240" w:hanging="360"/>
+      </w:pPr>
+      <w:rPr>
+        <w:rFonts w:ascii="Wingdings" w:hAnsi="Wingdings" w:hint="default"/>
+        <w:sz w:val="20"/>
+      </w:rPr>
+    </w:lvl>
+    <w:lvl w:ilvl="5" w:tentative="1">
+      <w:start w:val="1"/>
+      <w:numFmt w:val="bullet"/>
+      <w:lvlText w:val=""/>
+      <w:lvlJc w:val="left"/>
+      <w:pPr>
+        <w:tabs>
+          <w:tab w:val="num" w:pos="3960"/>
+        </w:tabs>
+        <w:ind w:left="3960" w:hanging="360"/>
+      </w:pPr>
+      <w:rPr>
+        <w:rFonts w:ascii="Wingdings" w:hAnsi="Wingdings" w:hint="default"/>
+        <w:sz w:val="20"/>
+      </w:rPr>
+    </w:lvl>
+    <w:lvl w:ilvl="6" w:tentative="1">
+      <w:start w:val="1"/>
+      <w:numFmt w:val="bullet"/>
+      <w:lvlText w:val=""/>
+      <w:lvlJc w:val="left"/>
+      <w:pPr>
+        <w:tabs>
+          <w:tab w:val="num" w:pos="4680"/>
+        </w:tabs>
+        <w:ind w:left="4680" w:hanging="360"/>
+      </w:pPr>
+      <w:rPr>
+        <w:rFonts w:ascii="Wingdings" w:hAnsi="Wingdings" w:hint="default"/>
+        <w:sz w:val="20"/>
+      </w:rPr>
+    </w:lvl>
+    <w:lvl w:ilvl="7" w:tentative="1">
+      <w:start w:val="1"/>
+      <w:numFmt w:val="bullet"/>
+      <w:lvlText w:val=""/>
+      <w:lvlJc w:val="left"/>
+      <w:pPr>
+        <w:tabs>
+          <w:tab w:val="num" w:pos="5400"/>
+        </w:tabs>
+        <w:ind w:left="5400" w:hanging="360"/>
+      </w:pPr>
+      <w:rPr>
+        <w:rFonts w:ascii="Wingdings" w:hAnsi="Wingdings" w:hint="default"/>
+        <w:sz w:val="20"/>
+      </w:rPr>
+    </w:lvl>
+    <w:lvl w:ilvl="8" w:tentative="1">
+      <w:start w:val="1"/>
+      <w:numFmt w:val="bullet"/>
+      <w:lvlText w:val=""/>
+      <w:lvlJc w:val="left"/>
+      <w:pPr>
+        <w:tabs>
+          <w:tab w:val="num" w:pos="6120"/>
+        </w:tabs>
+        <w:ind w:left="6120" w:hanging="360"/>
+      </w:pPr>
+      <w:rPr>
+        <w:rFonts w:ascii="Wingdings" w:hAnsi="Wingdings" w:hint="default"/>
+        <w:sz w:val="20"/>
+      </w:rPr>
+    </w:lvl>
+  </w:abstractNum>
+  <w:abstractNum w:abstractNumId="51" w15:restartNumberingAfterBreak="0">
     <w:nsid w:val="25A31F06"/>
     <w:multiLevelType w:val="multilevel"/>
     <w:tmpl w:val="C952FC68"/>
@@ -8649,7 +8787,156 @@
       </w:rPr>
     </w:lvl>
   </w:abstractNum>
-  <w:abstractNum w:abstractNumId="51" w15:restartNumberingAfterBreak="0">
+  <w:abstractNum w:abstractNumId="52" w15:restartNumberingAfterBreak="0">
+    <w:nsid w:val="25A567B5"/>
+    <w:multiLevelType w:val="multilevel"/>
+    <w:tmpl w:val="CFFC91DC"/>
+    <w:lvl w:ilvl="0">
+      <w:start w:val="1"/>
+      <w:numFmt w:val="bullet"/>
+      <w:lvlText w:val=""/>
+      <w:lvlJc w:val="left"/>
+      <w:pPr>
+        <w:tabs>
+          <w:tab w:val="num" w:pos="720"/>
+        </w:tabs>
+        <w:ind w:left="720" w:hanging="360"/>
+      </w:pPr>
+      <w:rPr>
+        <w:rFonts w:ascii="Symbol" w:hAnsi="Symbol" w:hint="default"/>
+        <w:sz w:val="20"/>
+      </w:rPr>
+    </w:lvl>
+    <w:lvl w:ilvl="1" w:tentative="1">
+      <w:start w:val="1"/>
+      <w:numFmt w:val="bullet"/>
+      <w:lvlText w:val="o"/>
+      <w:lvlJc w:val="left"/>
+      <w:pPr>
+        <w:tabs>
+          <w:tab w:val="num" w:pos="1440"/>
+        </w:tabs>
+        <w:ind w:left="1440" w:hanging="360"/>
+      </w:pPr>
+      <w:rPr>
+        <w:rFonts w:ascii="Courier New" w:hAnsi="Courier New" w:hint="default"/>
+        <w:sz w:val="20"/>
+      </w:rPr>
+    </w:lvl>
+    <w:lvl w:ilvl="2" w:tentative="1">
+      <w:start w:val="1"/>
+      <w:numFmt w:val="bullet"/>
+      <w:lvlText w:val=""/>
+      <w:lvlJc w:val="left"/>
+      <w:pPr>
+        <w:tabs>
+          <w:tab w:val="num" w:pos="2160"/>
+        </w:tabs>
+        <w:ind w:left="2160" w:hanging="360"/>
+      </w:pPr>
+      <w:rPr>
+        <w:rFonts w:ascii="Wingdings" w:hAnsi="Wingdings" w:hint="default"/>
+        <w:sz w:val="20"/>
+      </w:rPr>
+    </w:lvl>
+    <w:lvl w:ilvl="3" w:tentative="1">
+      <w:start w:val="1"/>
+      <w:numFmt w:val="bullet"/>
+      <w:lvlText w:val=""/>
+      <w:lvlJc w:val="left"/>
+      <w:pPr>
+        <w:tabs>
+          <w:tab w:val="num" w:pos="2880"/>
+        </w:tabs>
+        <w:ind w:left="2880" w:hanging="360"/>
+      </w:pPr>
+      <w:rPr>
+        <w:rFonts w:ascii="Wingdings" w:hAnsi="Wingdings" w:hint="default"/>
+        <w:sz w:val="20"/>
+      </w:rPr>
+    </w:lvl>
+    <w:lvl w:ilvl="4" w:tentative="1">
+      <w:start w:val="1"/>
+      <w:numFmt w:val="bullet"/>
+      <w:lvlText w:val=""/>
+      <w:lvlJc w:val="left"/>
+      <w:pPr>
+        <w:tabs>
+          <w:tab w:val="num" w:pos="3600"/>
+        </w:tabs>
+        <w:ind w:left="3600" w:hanging="360"/>
+      </w:pPr>
+      <w:rPr>
+        <w:rFonts w:ascii="Wingdings" w:hAnsi="Wingdings" w:hint="default"/>
+        <w:sz w:val="20"/>
+      </w:rPr>
+    </w:lvl>
+    <w:lvl w:ilvl="5" w:tentative="1">
+      <w:start w:val="1"/>
+      <w:numFmt w:val="bullet"/>
+      <w:lvlText w:val=""/>
+      <w:lvlJc w:val="left"/>
+      <w:pPr>
+        <w:tabs>
+          <w:tab w:val="num" w:pos="4320"/>
+        </w:tabs>
+        <w:ind w:left="4320" w:hanging="360"/>
+      </w:pPr>
+      <w:rPr>
+        <w:rFonts w:ascii="Wingdings" w:hAnsi="Wingdings" w:hint="default"/>
+        <w:sz w:val="20"/>
+      </w:rPr>
+    </w:lvl>
+    <w:lvl w:ilvl="6" w:tentative="1">
+      <w:start w:val="1"/>
+      <w:numFmt w:val="bullet"/>
+      <w:lvlText w:val=""/>
+      <w:lvlJc w:val="left"/>
+      <w:pPr>
+        <w:tabs>
+          <w:tab w:val="num" w:pos="5040"/>
+        </w:tabs>
+        <w:ind w:left="5040" w:hanging="360"/>
+      </w:pPr>
+      <w:rPr>
+        <w:rFonts w:ascii="Wingdings" w:hAnsi="Wingdings" w:hint="default"/>
+        <w:sz w:val="20"/>
+      </w:rPr>
+    </w:lvl>
+    <w:lvl w:ilvl="7" w:tentative="1">
+      <w:start w:val="1"/>
+      <w:numFmt w:val="bullet"/>
+      <w:lvlText w:val=""/>
+      <w:lvlJc w:val="left"/>
+      <w:pPr>
+        <w:tabs>
+          <w:tab w:val="num" w:pos="5760"/>
+        </w:tabs>
+        <w:ind w:left="5760" w:hanging="360"/>
+      </w:pPr>
+      <w:rPr>
+        <w:rFonts w:ascii="Wingdings" w:hAnsi="Wingdings" w:hint="default"/>
+        <w:sz w:val="20"/>
+      </w:rPr>
+    </w:lvl>
+    <w:lvl w:ilvl="8" w:tentative="1">
+      <w:start w:val="1"/>
+      <w:numFmt w:val="bullet"/>
+      <w:lvlText w:val=""/>
+      <w:lvlJc w:val="left"/>
+      <w:pPr>
+        <w:tabs>
+          <w:tab w:val="num" w:pos="6480"/>
+        </w:tabs>
+        <w:ind w:left="6480" w:hanging="360"/>
+      </w:pPr>
+      <w:rPr>
+        <w:rFonts w:ascii="Wingdings" w:hAnsi="Wingdings" w:hint="default"/>
+        <w:sz w:val="20"/>
+      </w:rPr>
+    </w:lvl>
+  </w:abstractNum>
+  <w:abstractNum w:abstractNumId="53" w15:restartNumberingAfterBreak="0">
     <w:nsid w:val="266A7CBC"/>
     <w:multiLevelType w:val="hybridMultilevel"/>
     <w:tmpl w:val="574694F4"/>
@@ -8762,7 +9049,7 @@
       </w:rPr>
     </w:lvl>
   </w:abstractNum>
-  <w:abstractNum w:abstractNumId="52" w15:restartNumberingAfterBreak="0">
+  <w:abstractNum w:abstractNumId="54" w15:restartNumberingAfterBreak="0">
     <w:nsid w:val="26AD6D11"/>
     <w:multiLevelType w:val="multilevel"/>
     <w:tmpl w:val="D332CE32"/>
@@ -8911,7 +9198,7 @@
       </w:rPr>
     </w:lvl>
   </w:abstractNum>
-  <w:abstractNum w:abstractNumId="53" w15:restartNumberingAfterBreak="0">
+  <w:abstractNum w:abstractNumId="55" w15:restartNumberingAfterBreak="0">
     <w:nsid w:val="26F82FB5"/>
     <w:multiLevelType w:val="multilevel"/>
     <w:tmpl w:val="FC7493FA"/>
@@ -9060,7 +9347,7 @@
       </w:rPr>
     </w:lvl>
   </w:abstractNum>
-  <w:abstractNum w:abstractNumId="54" w15:restartNumberingAfterBreak="0">
+  <w:abstractNum w:abstractNumId="56" w15:restartNumberingAfterBreak="0">
     <w:nsid w:val="2755135B"/>
     <w:multiLevelType w:val="multilevel"/>
     <w:tmpl w:val="6C266A0A"/>
@@ -9209,7 +9496,7 @@
       </w:rPr>
     </w:lvl>
   </w:abstractNum>
-  <w:abstractNum w:abstractNumId="55" w15:restartNumberingAfterBreak="0">
+  <w:abstractNum w:abstractNumId="57" w15:restartNumberingAfterBreak="0">
     <w:nsid w:val="27B32BE4"/>
     <w:multiLevelType w:val="multilevel"/>
     <w:tmpl w:val="2D903E34"/>
@@ -9358,7 +9645,7 @@
       </w:rPr>
     </w:lvl>
   </w:abstractNum>
-  <w:abstractNum w:abstractNumId="56" w15:restartNumberingAfterBreak="0">
+  <w:abstractNum w:abstractNumId="58" w15:restartNumberingAfterBreak="0">
     <w:nsid w:val="28807830"/>
     <w:multiLevelType w:val="multilevel"/>
     <w:tmpl w:val="45D8F112"/>
@@ -9507,7 +9794,7 @@
       </w:rPr>
     </w:lvl>
   </w:abstractNum>
-  <w:abstractNum w:abstractNumId="57" w15:restartNumberingAfterBreak="0">
+  <w:abstractNum w:abstractNumId="59" w15:restartNumberingAfterBreak="0">
     <w:nsid w:val="29A267E6"/>
     <w:multiLevelType w:val="multilevel"/>
     <w:tmpl w:val="7682B448"/>
@@ -9656,7 +9943,7 @@
       </w:rPr>
     </w:lvl>
   </w:abstractNum>
-  <w:abstractNum w:abstractNumId="58" w15:restartNumberingAfterBreak="0">
+  <w:abstractNum w:abstractNumId="60" w15:restartNumberingAfterBreak="0">
     <w:nsid w:val="29A432BF"/>
     <w:multiLevelType w:val="hybridMultilevel"/>
     <w:tmpl w:val="243680C0"/>
@@ -9769,7 +10056,7 @@
       </w:rPr>
     </w:lvl>
   </w:abstractNum>
-  <w:abstractNum w:abstractNumId="59" w15:restartNumberingAfterBreak="0">
+  <w:abstractNum w:abstractNumId="61" w15:restartNumberingAfterBreak="0">
     <w:nsid w:val="29D330D3"/>
     <w:multiLevelType w:val="multilevel"/>
     <w:tmpl w:val="836E7096"/>
@@ -9918,7 +10205,7 @@
       </w:rPr>
     </w:lvl>
   </w:abstractNum>
-  <w:abstractNum w:abstractNumId="60" w15:restartNumberingAfterBreak="0">
+  <w:abstractNum w:abstractNumId="62" w15:restartNumberingAfterBreak="0">
     <w:nsid w:val="29DE699B"/>
     <w:multiLevelType w:val="multilevel"/>
     <w:tmpl w:val="62B8AAA2"/>
@@ -10067,7 +10354,7 @@
       </w:rPr>
     </w:lvl>
   </w:abstractNum>
-  <w:abstractNum w:abstractNumId="61" w15:restartNumberingAfterBreak="0">
+  <w:abstractNum w:abstractNumId="63" w15:restartNumberingAfterBreak="0">
     <w:nsid w:val="2A2635EC"/>
     <w:multiLevelType w:val="multilevel"/>
     <w:tmpl w:val="DB20DBD6"/>
@@ -10216,7 +10503,7 @@
       </w:rPr>
     </w:lvl>
   </w:abstractNum>
-  <w:abstractNum w:abstractNumId="62" w15:restartNumberingAfterBreak="0">
+  <w:abstractNum w:abstractNumId="64" w15:restartNumberingAfterBreak="0">
     <w:nsid w:val="2A9B3E41"/>
     <w:multiLevelType w:val="multilevel"/>
     <w:tmpl w:val="ED94DFFA"/>
@@ -10365,7 +10652,7 @@
       </w:rPr>
     </w:lvl>
   </w:abstractNum>
-  <w:abstractNum w:abstractNumId="63" w15:restartNumberingAfterBreak="0">
+  <w:abstractNum w:abstractNumId="65" w15:restartNumberingAfterBreak="0">
     <w:nsid w:val="2AF11F2C"/>
     <w:multiLevelType w:val="hybridMultilevel"/>
     <w:tmpl w:val="239C5EAC"/>
@@ -10478,7 +10765,7 @@
       </w:rPr>
     </w:lvl>
   </w:abstractNum>
-  <w:abstractNum w:abstractNumId="64" w15:restartNumberingAfterBreak="0">
+  <w:abstractNum w:abstractNumId="66" w15:restartNumberingAfterBreak="0">
     <w:nsid w:val="2C7E12C4"/>
     <w:multiLevelType w:val="multilevel"/>
     <w:tmpl w:val="53D2EEFC"/>
@@ -10627,7 +10914,7 @@
       </w:rPr>
     </w:lvl>
   </w:abstractNum>
-  <w:abstractNum w:abstractNumId="65" w15:restartNumberingAfterBreak="0">
+  <w:abstractNum w:abstractNumId="67" w15:restartNumberingAfterBreak="0">
     <w:nsid w:val="2CBD7AD9"/>
     <w:multiLevelType w:val="multilevel"/>
     <w:tmpl w:val="66E8494E"/>
@@ -10776,7 +11063,7 @@
       </w:rPr>
     </w:lvl>
   </w:abstractNum>
-  <w:abstractNum w:abstractNumId="66" w15:restartNumberingAfterBreak="0">
+  <w:abstractNum w:abstractNumId="68" w15:restartNumberingAfterBreak="0">
     <w:nsid w:val="2E1F27FF"/>
     <w:multiLevelType w:val="multilevel"/>
     <w:tmpl w:val="1A3277F8"/>
@@ -10925,7 +11212,7 @@
       </w:rPr>
     </w:lvl>
   </w:abstractNum>
-  <w:abstractNum w:abstractNumId="67" w15:restartNumberingAfterBreak="0">
+  <w:abstractNum w:abstractNumId="69" w15:restartNumberingAfterBreak="0">
     <w:nsid w:val="2E8974A5"/>
     <w:multiLevelType w:val="hybridMultilevel"/>
     <w:tmpl w:val="7D4AE332"/>
@@ -11038,7 +11325,7 @@
       </w:rPr>
     </w:lvl>
   </w:abstractNum>
-  <w:abstractNum w:abstractNumId="68" w15:restartNumberingAfterBreak="0">
+  <w:abstractNum w:abstractNumId="70" w15:restartNumberingAfterBreak="0">
     <w:nsid w:val="2EC325B0"/>
     <w:multiLevelType w:val="hybridMultilevel"/>
     <w:tmpl w:val="F184D648"/>
@@ -11151,7 +11438,7 @@
       </w:rPr>
     </w:lvl>
   </w:abstractNum>
-  <w:abstractNum w:abstractNumId="69" w15:restartNumberingAfterBreak="0">
+  <w:abstractNum w:abstractNumId="71" w15:restartNumberingAfterBreak="0">
     <w:nsid w:val="30601AB4"/>
     <w:multiLevelType w:val="hybridMultilevel"/>
     <w:tmpl w:val="347256E8"/>
@@ -11264,7 +11551,156 @@
       </w:rPr>
     </w:lvl>
   </w:abstractNum>
-  <w:abstractNum w:abstractNumId="70" w15:restartNumberingAfterBreak="0">
+  <w:abstractNum w:abstractNumId="72" w15:restartNumberingAfterBreak="0">
+    <w:nsid w:val="30E6227A"/>
+    <w:multiLevelType w:val="multilevel"/>
+    <w:tmpl w:val="AE4E6D88"/>
+    <w:lvl w:ilvl="0">
+      <w:start w:val="1"/>
+      <w:numFmt w:val="bullet"/>
+      <w:lvlText w:val=""/>
+      <w:lvlJc w:val="left"/>
+      <w:pPr>
+        <w:tabs>
+          <w:tab w:val="num" w:pos="360"/>
+        </w:tabs>
+        <w:ind w:left="360" w:hanging="360"/>
+      </w:pPr>
+      <w:rPr>
+        <w:rFonts w:ascii="Symbol" w:hAnsi="Symbol" w:hint="default"/>
+        <w:sz w:val="20"/>
+      </w:rPr>
+    </w:lvl>
+    <w:lvl w:ilvl="1" w:tentative="1">
+      <w:start w:val="1"/>
+      <w:numFmt w:val="bullet"/>
+      <w:lvlText w:val="o"/>
+      <w:lvlJc w:val="left"/>
+      <w:pPr>
+        <w:tabs>
+          <w:tab w:val="num" w:pos="1080"/>
+        </w:tabs>
+        <w:ind w:left="1080" w:hanging="360"/>
+      </w:pPr>
+      <w:rPr>
+        <w:rFonts w:ascii="Courier New" w:hAnsi="Courier New" w:hint="default"/>
+        <w:sz w:val="20"/>
+      </w:rPr>
+    </w:lvl>
+    <w:lvl w:ilvl="2" w:tentative="1">
+      <w:start w:val="1"/>
+      <w:numFmt w:val="bullet"/>
+      <w:lvlText w:val=""/>
+      <w:lvlJc w:val="left"/>
+      <w:pPr>
+        <w:tabs>
+          <w:tab w:val="num" w:pos="1800"/>
+        </w:tabs>
+        <w:ind w:left="1800" w:hanging="360"/>
+      </w:pPr>
+      <w:rPr>
+        <w:rFonts w:ascii="Wingdings" w:hAnsi="Wingdings" w:hint="default"/>
+        <w:sz w:val="20"/>
+      </w:rPr>
+    </w:lvl>
+    <w:lvl w:ilvl="3" w:tentative="1">
+      <w:start w:val="1"/>
+      <w:numFmt w:val="bullet"/>
+      <w:lvlText w:val=""/>
+      <w:lvlJc w:val="left"/>
+      <w:pPr>
+        <w:tabs>
+          <w:tab w:val="num" w:pos="2520"/>
+        </w:tabs>
+        <w:ind w:left="2520" w:hanging="360"/>
+      </w:pPr>
+      <w:rPr>
+        <w:rFonts w:ascii="Wingdings" w:hAnsi="Wingdings" w:hint="default"/>
+        <w:sz w:val="20"/>
+      </w:rPr>
+    </w:lvl>
+    <w:lvl w:ilvl="4" w:tentative="1">
+      <w:start w:val="1"/>
+      <w:numFmt w:val="bullet"/>
+      <w:lvlText w:val=""/>
+      <w:lvlJc w:val="left"/>
+      <w:pPr>
+        <w:tabs>
+          <w:tab w:val="num" w:pos="3240"/>
+        </w:tabs>
+        <w:ind w:left="3240" w:hanging="360"/>
+      </w:pPr>
+      <w:rPr>
+        <w:rFonts w:ascii="Wingdings" w:hAnsi="Wingdings" w:hint="default"/>
+        <w:sz w:val="20"/>
+      </w:rPr>
+    </w:lvl>
+    <w:lvl w:ilvl="5" w:tentative="1">
+      <w:start w:val="1"/>
+      <w:numFmt w:val="bullet"/>
+      <w:lvlText w:val=""/>
+      <w:lvlJc w:val="left"/>
+      <w:pPr>
+        <w:tabs>
+          <w:tab w:val="num" w:pos="3960"/>
+        </w:tabs>
+        <w:ind w:left="3960" w:hanging="360"/>
+      </w:pPr>
+      <w:rPr>
+        <w:rFonts w:ascii="Wingdings" w:hAnsi="Wingdings" w:hint="default"/>
+        <w:sz w:val="20"/>
+      </w:rPr>
+    </w:lvl>
+    <w:lvl w:ilvl="6" w:tentative="1">
+      <w:start w:val="1"/>
+      <w:numFmt w:val="bullet"/>
+      <w:lvlText w:val=""/>
+      <w:lvlJc w:val="left"/>
+      <w:pPr>
+        <w:tabs>
+          <w:tab w:val="num" w:pos="4680"/>
+        </w:tabs>
+        <w:ind w:left="4680" w:hanging="360"/>
+      </w:pPr>
+      <w:rPr>
+        <w:rFonts w:ascii="Wingdings" w:hAnsi="Wingdings" w:hint="default"/>
+        <w:sz w:val="20"/>
+      </w:rPr>
+    </w:lvl>
+    <w:lvl w:ilvl="7" w:tentative="1">
+      <w:start w:val="1"/>
+      <w:numFmt w:val="bullet"/>
+      <w:lvlText w:val=""/>
+      <w:lvlJc w:val="left"/>
+      <w:pPr>
+        <w:tabs>
+          <w:tab w:val="num" w:pos="5400"/>
+        </w:tabs>
+        <w:ind w:left="5400" w:hanging="360"/>
+      </w:pPr>
+      <w:rPr>
+        <w:rFonts w:ascii="Wingdings" w:hAnsi="Wingdings" w:hint="default"/>
+        <w:sz w:val="20"/>
+      </w:rPr>
+    </w:lvl>
+    <w:lvl w:ilvl="8" w:tentative="1">
+      <w:start w:val="1"/>
+      <w:numFmt w:val="bullet"/>
+      <w:lvlText w:val=""/>
+      <w:lvlJc w:val="left"/>
+      <w:pPr>
+        <w:tabs>
+          <w:tab w:val="num" w:pos="6120"/>
+        </w:tabs>
+        <w:ind w:left="6120" w:hanging="360"/>
+      </w:pPr>
+      <w:rPr>
+        <w:rFonts w:ascii="Wingdings" w:hAnsi="Wingdings" w:hint="default"/>
+        <w:sz w:val="20"/>
+      </w:rPr>
+    </w:lvl>
+  </w:abstractNum>
+  <w:abstractNum w:abstractNumId="73" w15:restartNumberingAfterBreak="0">
     <w:nsid w:val="31A40BFF"/>
     <w:multiLevelType w:val="hybridMultilevel"/>
     <w:tmpl w:val="DDEAEC96"/>
@@ -11377,7 +11813,7 @@
       </w:rPr>
     </w:lvl>
   </w:abstractNum>
-  <w:abstractNum w:abstractNumId="71" w15:restartNumberingAfterBreak="0">
+  <w:abstractNum w:abstractNumId="74" w15:restartNumberingAfterBreak="0">
     <w:nsid w:val="31B34FA1"/>
     <w:multiLevelType w:val="multilevel"/>
     <w:tmpl w:val="7048DB52"/>
@@ -11526,7 +11962,7 @@
       </w:rPr>
     </w:lvl>
   </w:abstractNum>
-  <w:abstractNum w:abstractNumId="72" w15:restartNumberingAfterBreak="0">
+  <w:abstractNum w:abstractNumId="75" w15:restartNumberingAfterBreak="0">
     <w:nsid w:val="32440B3B"/>
     <w:multiLevelType w:val="multilevel"/>
     <w:tmpl w:val="2B8CDFE8"/>
@@ -11675,7 +12111,7 @@
       </w:rPr>
     </w:lvl>
   </w:abstractNum>
-  <w:abstractNum w:abstractNumId="73" w15:restartNumberingAfterBreak="0">
+  <w:abstractNum w:abstractNumId="76" w15:restartNumberingAfterBreak="0">
     <w:nsid w:val="332B311E"/>
     <w:multiLevelType w:val="hybridMultilevel"/>
     <w:tmpl w:val="4EBE338E"/>
@@ -11788,7 +12224,7 @@
       </w:rPr>
     </w:lvl>
   </w:abstractNum>
-  <w:abstractNum w:abstractNumId="74" w15:restartNumberingAfterBreak="0">
+  <w:abstractNum w:abstractNumId="77" w15:restartNumberingAfterBreak="0">
     <w:nsid w:val="33B25F17"/>
     <w:multiLevelType w:val="hybridMultilevel"/>
     <w:tmpl w:val="933E5446"/>
@@ -11901,7 +12337,7 @@
       </w:rPr>
     </w:lvl>
   </w:abstractNum>
-  <w:abstractNum w:abstractNumId="75" w15:restartNumberingAfterBreak="0">
+  <w:abstractNum w:abstractNumId="78" w15:restartNumberingAfterBreak="0">
     <w:nsid w:val="349C044A"/>
     <w:multiLevelType w:val="multilevel"/>
     <w:tmpl w:val="81481FEE"/>
@@ -12050,7 +12486,7 @@
       </w:rPr>
     </w:lvl>
   </w:abstractNum>
-  <w:abstractNum w:abstractNumId="76" w15:restartNumberingAfterBreak="0">
+  <w:abstractNum w:abstractNumId="79" w15:restartNumberingAfterBreak="0">
     <w:nsid w:val="35942C97"/>
     <w:multiLevelType w:val="multilevel"/>
     <w:tmpl w:val="A4A25342"/>
@@ -12199,7 +12635,7 @@
       </w:rPr>
     </w:lvl>
   </w:abstractNum>
-  <w:abstractNum w:abstractNumId="77" w15:restartNumberingAfterBreak="0">
+  <w:abstractNum w:abstractNumId="80" w15:restartNumberingAfterBreak="0">
     <w:nsid w:val="35E01E6F"/>
     <w:multiLevelType w:val="multilevel"/>
     <w:tmpl w:val="820C7186"/>
@@ -12348,7 +12784,7 @@
       </w:rPr>
     </w:lvl>
   </w:abstractNum>
-  <w:abstractNum w:abstractNumId="78" w15:restartNumberingAfterBreak="0">
+  <w:abstractNum w:abstractNumId="81" w15:restartNumberingAfterBreak="0">
     <w:nsid w:val="36CC63AA"/>
     <w:multiLevelType w:val="multilevel"/>
     <w:tmpl w:val="7048DB52"/>
@@ -12497,7 +12933,7 @@
       </w:rPr>
     </w:lvl>
   </w:abstractNum>
-  <w:abstractNum w:abstractNumId="79" w15:restartNumberingAfterBreak="0">
+  <w:abstractNum w:abstractNumId="82" w15:restartNumberingAfterBreak="0">
     <w:nsid w:val="380275F2"/>
     <w:multiLevelType w:val="hybridMultilevel"/>
     <w:tmpl w:val="09A457C2"/>
@@ -12610,7 +13046,7 @@
       </w:rPr>
     </w:lvl>
   </w:abstractNum>
-  <w:abstractNum w:abstractNumId="80" w15:restartNumberingAfterBreak="0">
+  <w:abstractNum w:abstractNumId="83" w15:restartNumberingAfterBreak="0">
     <w:nsid w:val="3B1F442B"/>
     <w:multiLevelType w:val="multilevel"/>
     <w:tmpl w:val="BCB29D22"/>
@@ -12759,7 +13195,7 @@
       </w:rPr>
     </w:lvl>
   </w:abstractNum>
-  <w:abstractNum w:abstractNumId="81" w15:restartNumberingAfterBreak="0">
+  <w:abstractNum w:abstractNumId="84" w15:restartNumberingAfterBreak="0">
     <w:nsid w:val="3C6D678A"/>
     <w:multiLevelType w:val="multilevel"/>
     <w:tmpl w:val="B9625338"/>
@@ -12908,7 +13344,7 @@
       </w:rPr>
     </w:lvl>
   </w:abstractNum>
-  <w:abstractNum w:abstractNumId="82" w15:restartNumberingAfterBreak="0">
+  <w:abstractNum w:abstractNumId="85" w15:restartNumberingAfterBreak="0">
     <w:nsid w:val="3CCA4947"/>
     <w:multiLevelType w:val="hybridMultilevel"/>
     <w:tmpl w:val="C78A8986"/>
@@ -13021,7 +13457,7 @@
       </w:rPr>
     </w:lvl>
   </w:abstractNum>
-  <w:abstractNum w:abstractNumId="83" w15:restartNumberingAfterBreak="0">
+  <w:abstractNum w:abstractNumId="86" w15:restartNumberingAfterBreak="0">
     <w:nsid w:val="3CF25C27"/>
     <w:multiLevelType w:val="multilevel"/>
     <w:tmpl w:val="0492A250"/>
@@ -13170,7 +13606,7 @@
       </w:rPr>
     </w:lvl>
   </w:abstractNum>
-  <w:abstractNum w:abstractNumId="84" w15:restartNumberingAfterBreak="0">
+  <w:abstractNum w:abstractNumId="87" w15:restartNumberingAfterBreak="0">
     <w:nsid w:val="3F3340FF"/>
     <w:multiLevelType w:val="multilevel"/>
     <w:tmpl w:val="6D167B4C"/>
@@ -13319,7 +13755,7 @@
       </w:rPr>
     </w:lvl>
   </w:abstractNum>
-  <w:abstractNum w:abstractNumId="85" w15:restartNumberingAfterBreak="0">
+  <w:abstractNum w:abstractNumId="88" w15:restartNumberingAfterBreak="0">
     <w:nsid w:val="3F987599"/>
     <w:multiLevelType w:val="multilevel"/>
     <w:tmpl w:val="697AD970"/>
@@ -13468,7 +13904,7 @@
       </w:rPr>
     </w:lvl>
   </w:abstractNum>
-  <w:abstractNum w:abstractNumId="86" w15:restartNumberingAfterBreak="0">
+  <w:abstractNum w:abstractNumId="89" w15:restartNumberingAfterBreak="0">
     <w:nsid w:val="40275175"/>
     <w:multiLevelType w:val="hybridMultilevel"/>
     <w:tmpl w:val="5F7A2A16"/>
@@ -13581,7 +14017,7 @@
       </w:rPr>
     </w:lvl>
   </w:abstractNum>
-  <w:abstractNum w:abstractNumId="87" w15:restartNumberingAfterBreak="0">
+  <w:abstractNum w:abstractNumId="90" w15:restartNumberingAfterBreak="0">
     <w:nsid w:val="40AE2067"/>
     <w:multiLevelType w:val="multilevel"/>
     <w:tmpl w:val="7048DB52"/>
@@ -13730,7 +14166,7 @@
       </w:rPr>
     </w:lvl>
   </w:abstractNum>
-  <w:abstractNum w:abstractNumId="88" w15:restartNumberingAfterBreak="0">
+  <w:abstractNum w:abstractNumId="91" w15:restartNumberingAfterBreak="0">
     <w:nsid w:val="40E429AE"/>
     <w:multiLevelType w:val="multilevel"/>
     <w:tmpl w:val="1FD6AFB4"/>
@@ -13879,7 +14315,7 @@
       </w:rPr>
     </w:lvl>
   </w:abstractNum>
-  <w:abstractNum w:abstractNumId="89" w15:restartNumberingAfterBreak="0">
+  <w:abstractNum w:abstractNumId="92" w15:restartNumberingAfterBreak="0">
     <w:nsid w:val="41115BAE"/>
     <w:multiLevelType w:val="multilevel"/>
     <w:tmpl w:val="DD0A4374"/>
@@ -14028,7 +14464,7 @@
       </w:rPr>
     </w:lvl>
   </w:abstractNum>
-  <w:abstractNum w:abstractNumId="90" w15:restartNumberingAfterBreak="0">
+  <w:abstractNum w:abstractNumId="93" w15:restartNumberingAfterBreak="0">
     <w:nsid w:val="419B27A7"/>
     <w:multiLevelType w:val="multilevel"/>
     <w:tmpl w:val="CE3A209C"/>
@@ -14177,7 +14613,7 @@
       </w:rPr>
     </w:lvl>
   </w:abstractNum>
-  <w:abstractNum w:abstractNumId="91" w15:restartNumberingAfterBreak="0">
+  <w:abstractNum w:abstractNumId="94" w15:restartNumberingAfterBreak="0">
     <w:nsid w:val="41E947E3"/>
     <w:multiLevelType w:val="hybridMultilevel"/>
     <w:tmpl w:val="C71AD8C2"/>
@@ -14290,7 +14726,7 @@
       </w:rPr>
     </w:lvl>
   </w:abstractNum>
-  <w:abstractNum w:abstractNumId="92" w15:restartNumberingAfterBreak="0">
+  <w:abstractNum w:abstractNumId="95" w15:restartNumberingAfterBreak="0">
     <w:nsid w:val="44EE2F7A"/>
     <w:multiLevelType w:val="hybridMultilevel"/>
     <w:tmpl w:val="DC900EE8"/>
@@ -14403,7 +14839,7 @@
       </w:rPr>
     </w:lvl>
   </w:abstractNum>
-  <w:abstractNum w:abstractNumId="93" w15:restartNumberingAfterBreak="0">
+  <w:abstractNum w:abstractNumId="96" w15:restartNumberingAfterBreak="0">
     <w:nsid w:val="44F41192"/>
     <w:multiLevelType w:val="multilevel"/>
     <w:tmpl w:val="8080119A"/>
@@ -14552,7 +14988,7 @@
       </w:rPr>
     </w:lvl>
   </w:abstractNum>
-  <w:abstractNum w:abstractNumId="94" w15:restartNumberingAfterBreak="0">
+  <w:abstractNum w:abstractNumId="97" w15:restartNumberingAfterBreak="0">
     <w:nsid w:val="451D1CC8"/>
     <w:multiLevelType w:val="multilevel"/>
     <w:tmpl w:val="AE30E052"/>
@@ -14701,7 +15137,7 @@
       </w:rPr>
     </w:lvl>
   </w:abstractNum>
-  <w:abstractNum w:abstractNumId="95" w15:restartNumberingAfterBreak="0">
+  <w:abstractNum w:abstractNumId="98" w15:restartNumberingAfterBreak="0">
     <w:nsid w:val="464C09DA"/>
     <w:multiLevelType w:val="multilevel"/>
     <w:tmpl w:val="3EF0EA22"/>
@@ -14850,7 +15286,7 @@
       </w:rPr>
     </w:lvl>
   </w:abstractNum>
-  <w:abstractNum w:abstractNumId="96" w15:restartNumberingAfterBreak="0">
+  <w:abstractNum w:abstractNumId="99" w15:restartNumberingAfterBreak="0">
     <w:nsid w:val="47484DF2"/>
     <w:multiLevelType w:val="multilevel"/>
     <w:tmpl w:val="0E8082E4"/>
@@ -14999,7 +15435,7 @@
       </w:rPr>
     </w:lvl>
   </w:abstractNum>
-  <w:abstractNum w:abstractNumId="97" w15:restartNumberingAfterBreak="0">
+  <w:abstractNum w:abstractNumId="100" w15:restartNumberingAfterBreak="0">
     <w:nsid w:val="48095422"/>
     <w:multiLevelType w:val="multilevel"/>
     <w:tmpl w:val="A6826606"/>
@@ -15148,7 +15584,7 @@
       </w:rPr>
     </w:lvl>
   </w:abstractNum>
-  <w:abstractNum w:abstractNumId="98" w15:restartNumberingAfterBreak="0">
+  <w:abstractNum w:abstractNumId="101" w15:restartNumberingAfterBreak="0">
     <w:nsid w:val="48437140"/>
     <w:multiLevelType w:val="hybridMultilevel"/>
     <w:tmpl w:val="DB143902"/>
@@ -15261,7 +15697,7 @@
       </w:rPr>
     </w:lvl>
   </w:abstractNum>
-  <w:abstractNum w:abstractNumId="99" w15:restartNumberingAfterBreak="0">
+  <w:abstractNum w:abstractNumId="102" w15:restartNumberingAfterBreak="0">
     <w:nsid w:val="493D71A2"/>
     <w:multiLevelType w:val="hybridMultilevel"/>
     <w:tmpl w:val="386E52FC"/>
@@ -15374,7 +15810,7 @@
       </w:rPr>
     </w:lvl>
   </w:abstractNum>
-  <w:abstractNum w:abstractNumId="100" w15:restartNumberingAfterBreak="0">
+  <w:abstractNum w:abstractNumId="103" w15:restartNumberingAfterBreak="0">
     <w:nsid w:val="4D267BCE"/>
     <w:multiLevelType w:val="multilevel"/>
     <w:tmpl w:val="BFE6738E"/>
@@ -15523,7 +15959,7 @@
       </w:rPr>
     </w:lvl>
   </w:abstractNum>
-  <w:abstractNum w:abstractNumId="101" w15:restartNumberingAfterBreak="0">
+  <w:abstractNum w:abstractNumId="104" w15:restartNumberingAfterBreak="0">
     <w:nsid w:val="4E0B3871"/>
     <w:multiLevelType w:val="multilevel"/>
     <w:tmpl w:val="090EE332"/>
@@ -15672,7 +16108,7 @@
       </w:rPr>
     </w:lvl>
   </w:abstractNum>
-  <w:abstractNum w:abstractNumId="102" w15:restartNumberingAfterBreak="0">
+  <w:abstractNum w:abstractNumId="105" w15:restartNumberingAfterBreak="0">
     <w:nsid w:val="4E3B7AC0"/>
     <w:multiLevelType w:val="multilevel"/>
     <w:tmpl w:val="CF5A3C30"/>
@@ -15821,7 +16257,7 @@
       </w:rPr>
     </w:lvl>
   </w:abstractNum>
-  <w:abstractNum w:abstractNumId="103" w15:restartNumberingAfterBreak="0">
+  <w:abstractNum w:abstractNumId="106" w15:restartNumberingAfterBreak="0">
     <w:nsid w:val="4ECF2486"/>
     <w:multiLevelType w:val="hybridMultilevel"/>
     <w:tmpl w:val="DFE29292"/>
@@ -15934,7 +16370,7 @@
       </w:rPr>
     </w:lvl>
   </w:abstractNum>
-  <w:abstractNum w:abstractNumId="104" w15:restartNumberingAfterBreak="0">
+  <w:abstractNum w:abstractNumId="107" w15:restartNumberingAfterBreak="0">
     <w:nsid w:val="4F7B74D9"/>
     <w:multiLevelType w:val="hybridMultilevel"/>
     <w:tmpl w:val="07E056F2"/>
@@ -16047,7 +16483,7 @@
       </w:rPr>
     </w:lvl>
   </w:abstractNum>
-  <w:abstractNum w:abstractNumId="105" w15:restartNumberingAfterBreak="0">
+  <w:abstractNum w:abstractNumId="108" w15:restartNumberingAfterBreak="0">
     <w:nsid w:val="51951584"/>
     <w:multiLevelType w:val="multilevel"/>
     <w:tmpl w:val="242E6DB4"/>
@@ -16196,7 +16632,7 @@
       </w:rPr>
     </w:lvl>
   </w:abstractNum>
-  <w:abstractNum w:abstractNumId="106" w15:restartNumberingAfterBreak="0">
+  <w:abstractNum w:abstractNumId="109" w15:restartNumberingAfterBreak="0">
     <w:nsid w:val="51D7769E"/>
     <w:multiLevelType w:val="hybridMultilevel"/>
     <w:tmpl w:val="7C1CB500"/>
@@ -16309,7 +16745,7 @@
       </w:rPr>
     </w:lvl>
   </w:abstractNum>
-  <w:abstractNum w:abstractNumId="107" w15:restartNumberingAfterBreak="0">
+  <w:abstractNum w:abstractNumId="110" w15:restartNumberingAfterBreak="0">
     <w:nsid w:val="53385D58"/>
     <w:multiLevelType w:val="hybridMultilevel"/>
     <w:tmpl w:val="9AFA04A8"/>
@@ -16422,7 +16858,7 @@
       </w:rPr>
     </w:lvl>
   </w:abstractNum>
-  <w:abstractNum w:abstractNumId="108" w15:restartNumberingAfterBreak="0">
+  <w:abstractNum w:abstractNumId="111" w15:restartNumberingAfterBreak="0">
     <w:nsid w:val="538F57ED"/>
     <w:multiLevelType w:val="multilevel"/>
     <w:tmpl w:val="AAFCFD94"/>
@@ -16571,7 +17007,7 @@
       </w:rPr>
     </w:lvl>
   </w:abstractNum>
-  <w:abstractNum w:abstractNumId="109" w15:restartNumberingAfterBreak="0">
+  <w:abstractNum w:abstractNumId="112" w15:restartNumberingAfterBreak="0">
     <w:nsid w:val="53B87D3A"/>
     <w:multiLevelType w:val="multilevel"/>
     <w:tmpl w:val="7048DB52"/>
@@ -16720,7 +17156,7 @@
       </w:rPr>
     </w:lvl>
   </w:abstractNum>
-  <w:abstractNum w:abstractNumId="110" w15:restartNumberingAfterBreak="0">
+  <w:abstractNum w:abstractNumId="113" w15:restartNumberingAfterBreak="0">
     <w:nsid w:val="553B12A0"/>
     <w:multiLevelType w:val="multilevel"/>
     <w:tmpl w:val="6444092E"/>
@@ -16869,7 +17305,7 @@
       </w:rPr>
     </w:lvl>
   </w:abstractNum>
-  <w:abstractNum w:abstractNumId="111" w15:restartNumberingAfterBreak="0">
+  <w:abstractNum w:abstractNumId="114" w15:restartNumberingAfterBreak="0">
     <w:nsid w:val="55515AE2"/>
     <w:multiLevelType w:val="multilevel"/>
     <w:tmpl w:val="B9C078E2"/>
@@ -17018,7 +17454,7 @@
       </w:rPr>
     </w:lvl>
   </w:abstractNum>
-  <w:abstractNum w:abstractNumId="112" w15:restartNumberingAfterBreak="0">
+  <w:abstractNum w:abstractNumId="115" w15:restartNumberingAfterBreak="0">
     <w:nsid w:val="557409DF"/>
     <w:multiLevelType w:val="multilevel"/>
     <w:tmpl w:val="DE0E74EC"/>
@@ -17167,7 +17603,7 @@
       </w:rPr>
     </w:lvl>
   </w:abstractNum>
-  <w:abstractNum w:abstractNumId="113" w15:restartNumberingAfterBreak="0">
+  <w:abstractNum w:abstractNumId="116" w15:restartNumberingAfterBreak="0">
     <w:nsid w:val="560C4D77"/>
     <w:multiLevelType w:val="hybridMultilevel"/>
     <w:tmpl w:val="2A06B524"/>
@@ -17280,7 +17716,7 @@
       </w:rPr>
     </w:lvl>
   </w:abstractNum>
-  <w:abstractNum w:abstractNumId="114" w15:restartNumberingAfterBreak="0">
+  <w:abstractNum w:abstractNumId="117" w15:restartNumberingAfterBreak="0">
     <w:nsid w:val="56DE3DC9"/>
     <w:multiLevelType w:val="hybridMultilevel"/>
     <w:tmpl w:val="0CDA8A80"/>
@@ -17393,7 +17829,7 @@
       </w:rPr>
     </w:lvl>
   </w:abstractNum>
-  <w:abstractNum w:abstractNumId="115" w15:restartNumberingAfterBreak="0">
+  <w:abstractNum w:abstractNumId="118" w15:restartNumberingAfterBreak="0">
     <w:nsid w:val="56FD7225"/>
     <w:multiLevelType w:val="hybridMultilevel"/>
     <w:tmpl w:val="73D2D198"/>
@@ -17479,7 +17915,7 @@
       </w:pPr>
     </w:lvl>
   </w:abstractNum>
-  <w:abstractNum w:abstractNumId="116" w15:restartNumberingAfterBreak="0">
+  <w:abstractNum w:abstractNumId="119" w15:restartNumberingAfterBreak="0">
     <w:nsid w:val="59112246"/>
     <w:multiLevelType w:val="multilevel"/>
     <w:tmpl w:val="250EEE56"/>
@@ -17628,7 +18064,7 @@
       </w:rPr>
     </w:lvl>
   </w:abstractNum>
-  <w:abstractNum w:abstractNumId="117" w15:restartNumberingAfterBreak="0">
+  <w:abstractNum w:abstractNumId="120" w15:restartNumberingAfterBreak="0">
     <w:nsid w:val="595D005F"/>
     <w:multiLevelType w:val="multilevel"/>
     <w:tmpl w:val="C75A7AAC"/>
@@ -17777,7 +18213,7 @@
       </w:rPr>
     </w:lvl>
   </w:abstractNum>
-  <w:abstractNum w:abstractNumId="118" w15:restartNumberingAfterBreak="0">
+  <w:abstractNum w:abstractNumId="121" w15:restartNumberingAfterBreak="0">
     <w:nsid w:val="5AD971F3"/>
     <w:multiLevelType w:val="multilevel"/>
     <w:tmpl w:val="7048DB52"/>
@@ -17926,7 +18362,7 @@
       </w:rPr>
     </w:lvl>
   </w:abstractNum>
-  <w:abstractNum w:abstractNumId="119" w15:restartNumberingAfterBreak="0">
+  <w:abstractNum w:abstractNumId="122" w15:restartNumberingAfterBreak="0">
     <w:nsid w:val="5B8952E2"/>
     <w:multiLevelType w:val="hybridMultilevel"/>
     <w:tmpl w:val="BC8E4B92"/>
@@ -18039,7 +18475,7 @@
       </w:rPr>
     </w:lvl>
   </w:abstractNum>
-  <w:abstractNum w:abstractNumId="120" w15:restartNumberingAfterBreak="0">
+  <w:abstractNum w:abstractNumId="123" w15:restartNumberingAfterBreak="0">
     <w:nsid w:val="5B9D68FF"/>
     <w:multiLevelType w:val="hybridMultilevel"/>
     <w:tmpl w:val="97365E1C"/>
@@ -18152,7 +18588,7 @@
       </w:rPr>
     </w:lvl>
   </w:abstractNum>
-  <w:abstractNum w:abstractNumId="121" w15:restartNumberingAfterBreak="0">
+  <w:abstractNum w:abstractNumId="124" w15:restartNumberingAfterBreak="0">
     <w:nsid w:val="5CAB4FC3"/>
     <w:multiLevelType w:val="multilevel"/>
     <w:tmpl w:val="53C8A9D2"/>
@@ -18301,7 +18737,7 @@
       </w:rPr>
     </w:lvl>
   </w:abstractNum>
-  <w:abstractNum w:abstractNumId="122" w15:restartNumberingAfterBreak="0">
+  <w:abstractNum w:abstractNumId="125" w15:restartNumberingAfterBreak="0">
     <w:nsid w:val="5E8C79BD"/>
     <w:multiLevelType w:val="multilevel"/>
     <w:tmpl w:val="53042FFE"/>
@@ -18450,7 +18886,7 @@
       </w:rPr>
     </w:lvl>
   </w:abstractNum>
-  <w:abstractNum w:abstractNumId="123" w15:restartNumberingAfterBreak="0">
+  <w:abstractNum w:abstractNumId="126" w15:restartNumberingAfterBreak="0">
     <w:nsid w:val="5EF0571B"/>
     <w:multiLevelType w:val="multilevel"/>
     <w:tmpl w:val="FAFE8AA8"/>
@@ -18599,7 +19035,7 @@
       </w:rPr>
     </w:lvl>
   </w:abstractNum>
-  <w:abstractNum w:abstractNumId="124" w15:restartNumberingAfterBreak="0">
+  <w:abstractNum w:abstractNumId="127" w15:restartNumberingAfterBreak="0">
     <w:nsid w:val="5F0042C8"/>
     <w:multiLevelType w:val="multilevel"/>
     <w:tmpl w:val="8514E290"/>
@@ -18748,7 +19184,7 @@
       </w:rPr>
     </w:lvl>
   </w:abstractNum>
-  <w:abstractNum w:abstractNumId="125" w15:restartNumberingAfterBreak="0">
+  <w:abstractNum w:abstractNumId="128" w15:restartNumberingAfterBreak="0">
     <w:nsid w:val="5F4F154C"/>
     <w:multiLevelType w:val="hybridMultilevel"/>
     <w:tmpl w:val="30B022AA"/>
@@ -18861,7 +19297,7 @@
       </w:rPr>
     </w:lvl>
   </w:abstractNum>
-  <w:abstractNum w:abstractNumId="126" w15:restartNumberingAfterBreak="0">
+  <w:abstractNum w:abstractNumId="129" w15:restartNumberingAfterBreak="0">
     <w:nsid w:val="615703C6"/>
     <w:multiLevelType w:val="hybridMultilevel"/>
     <w:tmpl w:val="F8241636"/>
@@ -18974,7 +19410,7 @@
       </w:rPr>
     </w:lvl>
   </w:abstractNum>
-  <w:abstractNum w:abstractNumId="127" w15:restartNumberingAfterBreak="0">
+  <w:abstractNum w:abstractNumId="130" w15:restartNumberingAfterBreak="0">
     <w:nsid w:val="616A756B"/>
     <w:multiLevelType w:val="multilevel"/>
     <w:tmpl w:val="C7628FEE"/>
@@ -19123,7 +19559,7 @@
       </w:rPr>
     </w:lvl>
   </w:abstractNum>
-  <w:abstractNum w:abstractNumId="128" w15:restartNumberingAfterBreak="0">
+  <w:abstractNum w:abstractNumId="131" w15:restartNumberingAfterBreak="0">
     <w:nsid w:val="619965E5"/>
     <w:multiLevelType w:val="multilevel"/>
     <w:tmpl w:val="9B465DD6"/>
@@ -19272,7 +19708,7 @@
       </w:rPr>
     </w:lvl>
   </w:abstractNum>
-  <w:abstractNum w:abstractNumId="129" w15:restartNumberingAfterBreak="0">
+  <w:abstractNum w:abstractNumId="132" w15:restartNumberingAfterBreak="0">
     <w:nsid w:val="62651B6A"/>
     <w:multiLevelType w:val="multilevel"/>
     <w:tmpl w:val="7048DB52"/>
@@ -19421,7 +19857,7 @@
       </w:rPr>
     </w:lvl>
   </w:abstractNum>
-  <w:abstractNum w:abstractNumId="130" w15:restartNumberingAfterBreak="0">
+  <w:abstractNum w:abstractNumId="133" w15:restartNumberingAfterBreak="0">
     <w:nsid w:val="62726CA4"/>
     <w:multiLevelType w:val="hybridMultilevel"/>
     <w:tmpl w:val="173CD39A"/>
@@ -19534,7 +19970,7 @@
       </w:rPr>
     </w:lvl>
   </w:abstractNum>
-  <w:abstractNum w:abstractNumId="131" w15:restartNumberingAfterBreak="0">
+  <w:abstractNum w:abstractNumId="134" w15:restartNumberingAfterBreak="0">
     <w:nsid w:val="65677D4A"/>
     <w:multiLevelType w:val="multilevel"/>
     <w:tmpl w:val="A4CA805E"/>
@@ -19683,7 +20119,7 @@
       </w:rPr>
     </w:lvl>
   </w:abstractNum>
-  <w:abstractNum w:abstractNumId="132" w15:restartNumberingAfterBreak="0">
+  <w:abstractNum w:abstractNumId="135" w15:restartNumberingAfterBreak="0">
     <w:nsid w:val="66C262AB"/>
     <w:multiLevelType w:val="multilevel"/>
     <w:tmpl w:val="041AD254"/>
@@ -19832,7 +20268,7 @@
       </w:rPr>
     </w:lvl>
   </w:abstractNum>
-  <w:abstractNum w:abstractNumId="133" w15:restartNumberingAfterBreak="0">
+  <w:abstractNum w:abstractNumId="136" w15:restartNumberingAfterBreak="0">
     <w:nsid w:val="672E2C87"/>
     <w:multiLevelType w:val="multilevel"/>
     <w:tmpl w:val="7048DB52"/>
@@ -19981,7 +20417,7 @@
       </w:rPr>
     </w:lvl>
   </w:abstractNum>
-  <w:abstractNum w:abstractNumId="134" w15:restartNumberingAfterBreak="0">
+  <w:abstractNum w:abstractNumId="137" w15:restartNumberingAfterBreak="0">
     <w:nsid w:val="68EB57D7"/>
     <w:multiLevelType w:val="hybridMultilevel"/>
     <w:tmpl w:val="3B50B75E"/>
@@ -20094,7 +20530,7 @@
       </w:rPr>
     </w:lvl>
   </w:abstractNum>
-  <w:abstractNum w:abstractNumId="135" w15:restartNumberingAfterBreak="0">
+  <w:abstractNum w:abstractNumId="138" w15:restartNumberingAfterBreak="0">
     <w:nsid w:val="695E7EBD"/>
     <w:multiLevelType w:val="multilevel"/>
     <w:tmpl w:val="DF50B59E"/>
@@ -20243,7 +20679,7 @@
       </w:rPr>
     </w:lvl>
   </w:abstractNum>
-  <w:abstractNum w:abstractNumId="136" w15:restartNumberingAfterBreak="0">
+  <w:abstractNum w:abstractNumId="139" w15:restartNumberingAfterBreak="0">
     <w:nsid w:val="6A092E3D"/>
     <w:multiLevelType w:val="multilevel"/>
     <w:tmpl w:val="090A41C8"/>
@@ -20392,7 +20828,7 @@
       </w:rPr>
     </w:lvl>
   </w:abstractNum>
-  <w:abstractNum w:abstractNumId="137" w15:restartNumberingAfterBreak="0">
+  <w:abstractNum w:abstractNumId="140" w15:restartNumberingAfterBreak="0">
     <w:nsid w:val="6A1F62E9"/>
     <w:multiLevelType w:val="multilevel"/>
     <w:tmpl w:val="91529398"/>
@@ -20541,7 +20977,7 @@
       </w:rPr>
     </w:lvl>
   </w:abstractNum>
-  <w:abstractNum w:abstractNumId="138" w15:restartNumberingAfterBreak="0">
+  <w:abstractNum w:abstractNumId="141" w15:restartNumberingAfterBreak="0">
     <w:nsid w:val="6A923837"/>
     <w:multiLevelType w:val="hybridMultilevel"/>
     <w:tmpl w:val="3A4E11E8"/>
@@ -20654,7 +21090,7 @@
       </w:rPr>
     </w:lvl>
   </w:abstractNum>
-  <w:abstractNum w:abstractNumId="139" w15:restartNumberingAfterBreak="0">
+  <w:abstractNum w:abstractNumId="142" w15:restartNumberingAfterBreak="0">
     <w:nsid w:val="6AAE6342"/>
     <w:multiLevelType w:val="multilevel"/>
     <w:tmpl w:val="2E7C919A"/>
@@ -20803,7 +21239,7 @@
       </w:rPr>
     </w:lvl>
   </w:abstractNum>
-  <w:abstractNum w:abstractNumId="140" w15:restartNumberingAfterBreak="0">
+  <w:abstractNum w:abstractNumId="143" w15:restartNumberingAfterBreak="0">
     <w:nsid w:val="6AE110BB"/>
     <w:multiLevelType w:val="hybridMultilevel"/>
     <w:tmpl w:val="03F8C014"/>
@@ -20916,7 +21352,7 @@
       </w:rPr>
     </w:lvl>
   </w:abstractNum>
-  <w:abstractNum w:abstractNumId="141" w15:restartNumberingAfterBreak="0">
+  <w:abstractNum w:abstractNumId="144" w15:restartNumberingAfterBreak="0">
     <w:nsid w:val="6AF45C6E"/>
     <w:multiLevelType w:val="multilevel"/>
     <w:tmpl w:val="4202DB2A"/>
@@ -21065,7 +21501,7 @@
       </w:rPr>
     </w:lvl>
   </w:abstractNum>
-  <w:abstractNum w:abstractNumId="142" w15:restartNumberingAfterBreak="0">
+  <w:abstractNum w:abstractNumId="145" w15:restartNumberingAfterBreak="0">
     <w:nsid w:val="6B223D72"/>
     <w:multiLevelType w:val="hybridMultilevel"/>
     <w:tmpl w:val="E5A818D2"/>
@@ -21178,7 +21614,7 @@
       </w:rPr>
     </w:lvl>
   </w:abstractNum>
-  <w:abstractNum w:abstractNumId="143" w15:restartNumberingAfterBreak="0">
+  <w:abstractNum w:abstractNumId="146" w15:restartNumberingAfterBreak="0">
     <w:nsid w:val="6C5124B5"/>
     <w:multiLevelType w:val="hybridMultilevel"/>
     <w:tmpl w:val="F216F09A"/>
@@ -21291,7 +21727,7 @@
       </w:rPr>
     </w:lvl>
   </w:abstractNum>
-  <w:abstractNum w:abstractNumId="144" w15:restartNumberingAfterBreak="0">
+  <w:abstractNum w:abstractNumId="147" w15:restartNumberingAfterBreak="0">
     <w:nsid w:val="6CFF38DA"/>
     <w:multiLevelType w:val="multilevel"/>
     <w:tmpl w:val="758CDE8E"/>
@@ -21440,7 +21876,7 @@
       </w:rPr>
     </w:lvl>
   </w:abstractNum>
-  <w:abstractNum w:abstractNumId="145" w15:restartNumberingAfterBreak="0">
+  <w:abstractNum w:abstractNumId="148" w15:restartNumberingAfterBreak="0">
     <w:nsid w:val="6D285BDE"/>
     <w:multiLevelType w:val="multilevel"/>
     <w:tmpl w:val="5BEE1D5C"/>
@@ -21589,7 +22025,7 @@
       </w:rPr>
     </w:lvl>
   </w:abstractNum>
-  <w:abstractNum w:abstractNumId="146" w15:restartNumberingAfterBreak="0">
+  <w:abstractNum w:abstractNumId="149" w15:restartNumberingAfterBreak="0">
     <w:nsid w:val="6D3016D7"/>
     <w:multiLevelType w:val="multilevel"/>
     <w:tmpl w:val="F586C01C"/>
@@ -21738,7 +22174,7 @@
       </w:rPr>
     </w:lvl>
   </w:abstractNum>
-  <w:abstractNum w:abstractNumId="147" w15:restartNumberingAfterBreak="0">
+  <w:abstractNum w:abstractNumId="150" w15:restartNumberingAfterBreak="0">
     <w:nsid w:val="6D9D5ECA"/>
     <w:multiLevelType w:val="multilevel"/>
     <w:tmpl w:val="2DB03242"/>
@@ -21879,7 +22315,7 @@
       </w:rPr>
     </w:lvl>
   </w:abstractNum>
-  <w:abstractNum w:abstractNumId="148" w15:restartNumberingAfterBreak="0">
+  <w:abstractNum w:abstractNumId="151" w15:restartNumberingAfterBreak="0">
     <w:nsid w:val="6E46438A"/>
     <w:multiLevelType w:val="multilevel"/>
     <w:tmpl w:val="8B42DAFE"/>
@@ -22028,7 +22464,7 @@
       </w:rPr>
     </w:lvl>
   </w:abstractNum>
-  <w:abstractNum w:abstractNumId="149" w15:restartNumberingAfterBreak="0">
+  <w:abstractNum w:abstractNumId="152" w15:restartNumberingAfterBreak="0">
     <w:nsid w:val="6F683E55"/>
     <w:multiLevelType w:val="hybridMultilevel"/>
     <w:tmpl w:val="0B703C78"/>
@@ -22141,7 +22577,7 @@
       </w:rPr>
     </w:lvl>
   </w:abstractNum>
-  <w:abstractNum w:abstractNumId="150" w15:restartNumberingAfterBreak="0">
+  <w:abstractNum w:abstractNumId="153" w15:restartNumberingAfterBreak="0">
     <w:nsid w:val="70844FBE"/>
     <w:multiLevelType w:val="multilevel"/>
     <w:tmpl w:val="42FC17DA"/>
@@ -22290,7 +22726,7 @@
       </w:rPr>
     </w:lvl>
   </w:abstractNum>
-  <w:abstractNum w:abstractNumId="151" w15:restartNumberingAfterBreak="0">
+  <w:abstractNum w:abstractNumId="154" w15:restartNumberingAfterBreak="0">
     <w:nsid w:val="70925A37"/>
     <w:multiLevelType w:val="hybridMultilevel"/>
     <w:tmpl w:val="5B36A86C"/>
@@ -22403,7 +22839,7 @@
       </w:rPr>
     </w:lvl>
   </w:abstractNum>
-  <w:abstractNum w:abstractNumId="152" w15:restartNumberingAfterBreak="0">
+  <w:abstractNum w:abstractNumId="155" w15:restartNumberingAfterBreak="0">
     <w:nsid w:val="72270362"/>
     <w:multiLevelType w:val="hybridMultilevel"/>
     <w:tmpl w:val="D624C992"/>
@@ -22516,7 +22952,7 @@
       </w:rPr>
     </w:lvl>
   </w:abstractNum>
-  <w:abstractNum w:abstractNumId="153" w15:restartNumberingAfterBreak="0">
+  <w:abstractNum w:abstractNumId="156" w15:restartNumberingAfterBreak="0">
     <w:nsid w:val="72877B6D"/>
     <w:multiLevelType w:val="multilevel"/>
     <w:tmpl w:val="AD761D40"/>
@@ -22665,7 +23101,7 @@
       </w:rPr>
     </w:lvl>
   </w:abstractNum>
-  <w:abstractNum w:abstractNumId="154" w15:restartNumberingAfterBreak="0">
+  <w:abstractNum w:abstractNumId="157" w15:restartNumberingAfterBreak="0">
     <w:nsid w:val="74C56DDB"/>
     <w:multiLevelType w:val="multilevel"/>
     <w:tmpl w:val="821E30A8"/>
@@ -22814,7 +23250,7 @@
       </w:rPr>
     </w:lvl>
   </w:abstractNum>
-  <w:abstractNum w:abstractNumId="155" w15:restartNumberingAfterBreak="0">
+  <w:abstractNum w:abstractNumId="158" w15:restartNumberingAfterBreak="0">
     <w:nsid w:val="76BA0C88"/>
     <w:multiLevelType w:val="multilevel"/>
     <w:tmpl w:val="000AEBF2"/>
@@ -22963,7 +23399,7 @@
       </w:rPr>
     </w:lvl>
   </w:abstractNum>
-  <w:abstractNum w:abstractNumId="156" w15:restartNumberingAfterBreak="0">
+  <w:abstractNum w:abstractNumId="159" w15:restartNumberingAfterBreak="0">
     <w:nsid w:val="77565FFD"/>
     <w:multiLevelType w:val="multilevel"/>
     <w:tmpl w:val="758CF480"/>
@@ -23112,7 +23548,7 @@
       </w:rPr>
     </w:lvl>
   </w:abstractNum>
-  <w:abstractNum w:abstractNumId="157" w15:restartNumberingAfterBreak="0">
+  <w:abstractNum w:abstractNumId="160" w15:restartNumberingAfterBreak="0">
     <w:nsid w:val="7768204B"/>
     <w:multiLevelType w:val="multilevel"/>
     <w:tmpl w:val="0D781874"/>
@@ -23261,7 +23697,7 @@
       </w:rPr>
     </w:lvl>
   </w:abstractNum>
-  <w:abstractNum w:abstractNumId="158" w15:restartNumberingAfterBreak="0">
+  <w:abstractNum w:abstractNumId="161" w15:restartNumberingAfterBreak="0">
     <w:nsid w:val="77751EAE"/>
     <w:multiLevelType w:val="multilevel"/>
     <w:tmpl w:val="4D94A6F2"/>
@@ -23410,7 +23846,7 @@
       </w:rPr>
     </w:lvl>
   </w:abstractNum>
-  <w:abstractNum w:abstractNumId="159" w15:restartNumberingAfterBreak="0">
+  <w:abstractNum w:abstractNumId="162" w15:restartNumberingAfterBreak="0">
     <w:nsid w:val="79866727"/>
     <w:multiLevelType w:val="hybridMultilevel"/>
     <w:tmpl w:val="9066462A"/>
@@ -23523,7 +23959,7 @@
       </w:rPr>
     </w:lvl>
   </w:abstractNum>
-  <w:abstractNum w:abstractNumId="160" w15:restartNumberingAfterBreak="0">
+  <w:abstractNum w:abstractNumId="163" w15:restartNumberingAfterBreak="0">
     <w:nsid w:val="7A375BE8"/>
     <w:multiLevelType w:val="hybridMultilevel"/>
     <w:tmpl w:val="1CEA8AD8"/>
@@ -23636,7 +24072,7 @@
       </w:rPr>
     </w:lvl>
   </w:abstractNum>
-  <w:abstractNum w:abstractNumId="161" w15:restartNumberingAfterBreak="0">
+  <w:abstractNum w:abstractNumId="164" w15:restartNumberingAfterBreak="0">
     <w:nsid w:val="7BE26659"/>
     <w:multiLevelType w:val="multilevel"/>
     <w:tmpl w:val="5CC8007C"/>
@@ -23785,7 +24221,7 @@
       </w:rPr>
     </w:lvl>
   </w:abstractNum>
-  <w:abstractNum w:abstractNumId="162" w15:restartNumberingAfterBreak="0">
+  <w:abstractNum w:abstractNumId="165" w15:restartNumberingAfterBreak="0">
     <w:nsid w:val="7C2729A1"/>
     <w:multiLevelType w:val="hybridMultilevel"/>
     <w:tmpl w:val="765AF342"/>
@@ -23898,7 +24334,7 @@
       </w:rPr>
     </w:lvl>
   </w:abstractNum>
-  <w:abstractNum w:abstractNumId="163" w15:restartNumberingAfterBreak="0">
+  <w:abstractNum w:abstractNumId="166" w15:restartNumberingAfterBreak="0">
     <w:nsid w:val="7D12641E"/>
     <w:multiLevelType w:val="multilevel"/>
     <w:tmpl w:val="1BCCCCEE"/>
@@ -24047,7 +24483,7 @@
       </w:rPr>
     </w:lvl>
   </w:abstractNum>
-  <w:abstractNum w:abstractNumId="164" w15:restartNumberingAfterBreak="0">
+  <w:abstractNum w:abstractNumId="167" w15:restartNumberingAfterBreak="0">
     <w:nsid w:val="7EB35DC7"/>
     <w:multiLevelType w:val="hybridMultilevel"/>
     <w:tmpl w:val="C5B8B8BA"/>
@@ -24160,7 +24596,7 @@
       </w:rPr>
     </w:lvl>
   </w:abstractNum>
-  <w:abstractNum w:abstractNumId="165" w15:restartNumberingAfterBreak="0">
+  <w:abstractNum w:abstractNumId="168" w15:restartNumberingAfterBreak="0">
     <w:nsid w:val="7F786244"/>
     <w:multiLevelType w:val="multilevel"/>
     <w:tmpl w:val="128CFF36"/>
@@ -24313,13 +24749,13 @@
     <w:abstractNumId w:val="13"/>
   </w:num>
   <w:num w:numId="2" w16cid:durableId="1496452659">
-    <w:abstractNumId w:val="147"/>
+    <w:abstractNumId w:val="150"/>
   </w:num>
   <w:num w:numId="3" w16cid:durableId="1387801634">
     <w:abstractNumId w:val="5"/>
   </w:num>
   <w:num w:numId="4" w16cid:durableId="1356728775">
-    <w:abstractNumId w:val="92"/>
+    <w:abstractNumId w:val="95"/>
   </w:num>
   <w:num w:numId="5" w16cid:durableId="32924388">
     <w:abstractNumId w:val="24"/>
@@ -24328,16 +24764,16 @@
     <w:abstractNumId w:val="6"/>
   </w:num>
   <w:num w:numId="7" w16cid:durableId="1924561310">
-    <w:abstractNumId w:val="142"/>
+    <w:abstractNumId w:val="145"/>
   </w:num>
   <w:num w:numId="8" w16cid:durableId="149948420">
-    <w:abstractNumId w:val="58"/>
+    <w:abstractNumId w:val="60"/>
   </w:num>
   <w:num w:numId="9" w16cid:durableId="1616718614">
     <w:abstractNumId w:val="45"/>
   </w:num>
   <w:num w:numId="10" w16cid:durableId="1218053805">
-    <w:abstractNumId w:val="104"/>
+    <w:abstractNumId w:val="107"/>
   </w:num>
   <w:num w:numId="11" w16cid:durableId="861043857">
     <w:abstractNumId w:val="27"/>
@@ -24346,13 +24782,13 @@
     <w:abstractNumId w:val="41"/>
   </w:num>
   <w:num w:numId="13" w16cid:durableId="1332179234">
-    <w:abstractNumId w:val="140"/>
+    <w:abstractNumId w:val="143"/>
   </w:num>
   <w:num w:numId="14" w16cid:durableId="728843215">
     <w:abstractNumId w:val="26"/>
   </w:num>
   <w:num w:numId="15" w16cid:durableId="1085151054">
-    <w:abstractNumId w:val="79"/>
+    <w:abstractNumId w:val="82"/>
   </w:num>
   <w:num w:numId="16" w16cid:durableId="1252276635">
     <w:abstractNumId w:val="42"/>
@@ -24364,25 +24800,25 @@
     <w:abstractNumId w:val="30"/>
   </w:num>
   <w:num w:numId="19" w16cid:durableId="387723913">
-    <w:abstractNumId w:val="162"/>
+    <w:abstractNumId w:val="165"/>
   </w:num>
   <w:num w:numId="20" w16cid:durableId="1893344950">
-    <w:abstractNumId w:val="98"/>
+    <w:abstractNumId w:val="101"/>
   </w:num>
   <w:num w:numId="21" w16cid:durableId="983198546">
-    <w:abstractNumId w:val="152"/>
+    <w:abstractNumId w:val="155"/>
   </w:num>
   <w:num w:numId="22" w16cid:durableId="233512181">
     <w:abstractNumId w:val="9"/>
   </w:num>
   <w:num w:numId="23" w16cid:durableId="2020959240">
-    <w:abstractNumId w:val="103"/>
+    <w:abstractNumId w:val="106"/>
   </w:num>
   <w:num w:numId="24" w16cid:durableId="1257439488">
-    <w:abstractNumId w:val="160"/>
+    <w:abstractNumId w:val="163"/>
   </w:num>
   <w:num w:numId="25" w16cid:durableId="1671365679">
-    <w:abstractNumId w:val="86"/>
+    <w:abstractNumId w:val="89"/>
   </w:num>
   <w:num w:numId="26" w16cid:durableId="1635789156">
     <w:abstractNumId w:val="35"/>
@@ -24391,16 +24827,16 @@
     <w:abstractNumId w:val="8"/>
   </w:num>
   <w:num w:numId="28" w16cid:durableId="978264522">
-    <w:abstractNumId w:val="164"/>
+    <w:abstractNumId w:val="167"/>
   </w:num>
   <w:num w:numId="29" w16cid:durableId="1325428185">
-    <w:abstractNumId w:val="130"/>
+    <w:abstractNumId w:val="133"/>
   </w:num>
   <w:num w:numId="30" w16cid:durableId="459302228">
     <w:abstractNumId w:val="25"/>
   </w:num>
   <w:num w:numId="31" w16cid:durableId="1101142882">
-    <w:abstractNumId w:val="70"/>
+    <w:abstractNumId w:val="73"/>
   </w:num>
   <w:num w:numId="32" w16cid:durableId="1909419742">
     <w:abstractNumId w:val="38"/>
@@ -24409,55 +24845,55 @@
     <w:abstractNumId w:val="32"/>
   </w:num>
   <w:num w:numId="34" w16cid:durableId="248538847">
-    <w:abstractNumId w:val="107"/>
+    <w:abstractNumId w:val="110"/>
   </w:num>
   <w:num w:numId="35" w16cid:durableId="1643995615">
-    <w:abstractNumId w:val="143"/>
+    <w:abstractNumId w:val="146"/>
   </w:num>
   <w:num w:numId="36" w16cid:durableId="2064281585">
-    <w:abstractNumId w:val="82"/>
+    <w:abstractNumId w:val="85"/>
   </w:num>
   <w:num w:numId="37" w16cid:durableId="201408908">
-    <w:abstractNumId w:val="134"/>
+    <w:abstractNumId w:val="137"/>
   </w:num>
   <w:num w:numId="38" w16cid:durableId="432671344">
-    <w:abstractNumId w:val="67"/>
+    <w:abstractNumId w:val="69"/>
   </w:num>
   <w:num w:numId="39" w16cid:durableId="31150646">
     <w:abstractNumId w:val="37"/>
   </w:num>
   <w:num w:numId="40" w16cid:durableId="552497635">
-    <w:abstractNumId w:val="149"/>
+    <w:abstractNumId w:val="152"/>
   </w:num>
   <w:num w:numId="41" w16cid:durableId="1633556666">
-    <w:abstractNumId w:val="99"/>
+    <w:abstractNumId w:val="102"/>
   </w:num>
   <w:num w:numId="42" w16cid:durableId="844514872">
     <w:abstractNumId w:val="18"/>
   </w:num>
   <w:num w:numId="43" w16cid:durableId="1599025623">
-    <w:abstractNumId w:val="69"/>
+    <w:abstractNumId w:val="71"/>
   </w:num>
   <w:num w:numId="44" w16cid:durableId="369231477">
-    <w:abstractNumId w:val="119"/>
+    <w:abstractNumId w:val="122"/>
   </w:num>
   <w:num w:numId="45" w16cid:durableId="152717700">
     <w:abstractNumId w:val="21"/>
   </w:num>
   <w:num w:numId="46" w16cid:durableId="1599479932">
-    <w:abstractNumId w:val="126"/>
+    <w:abstractNumId w:val="129"/>
   </w:num>
   <w:num w:numId="47" w16cid:durableId="1484393027">
-    <w:abstractNumId w:val="106"/>
+    <w:abstractNumId w:val="109"/>
   </w:num>
   <w:num w:numId="48" w16cid:durableId="1086415986">
-    <w:abstractNumId w:val="74"/>
+    <w:abstractNumId w:val="77"/>
   </w:num>
   <w:num w:numId="49" w16cid:durableId="841893569">
     <w:abstractNumId w:val="19"/>
   </w:num>
   <w:num w:numId="50" w16cid:durableId="1051466161">
-    <w:abstractNumId w:val="77"/>
+    <w:abstractNumId w:val="80"/>
   </w:num>
   <w:num w:numId="51" w16cid:durableId="1786386363">
     <w:abstractNumId w:val="14"/>
@@ -24466,16 +24902,16 @@
     <w:abstractNumId w:val="28"/>
   </w:num>
   <w:num w:numId="53" w16cid:durableId="1751847371">
-    <w:abstractNumId w:val="137"/>
+    <w:abstractNumId w:val="140"/>
   </w:num>
   <w:num w:numId="54" w16cid:durableId="1473408410">
-    <w:abstractNumId w:val="59"/>
+    <w:abstractNumId w:val="61"/>
   </w:num>
   <w:num w:numId="55" w16cid:durableId="1378504719">
-    <w:abstractNumId w:val="145"/>
+    <w:abstractNumId w:val="148"/>
   </w:num>
   <w:num w:numId="56" w16cid:durableId="297761021">
-    <w:abstractNumId w:val="115"/>
+    <w:abstractNumId w:val="118"/>
   </w:num>
   <w:num w:numId="57" w16cid:durableId="1012074182">
     <w:abstractNumId w:val="1"/>
@@ -24490,55 +24926,55 @@
     <w:abstractNumId w:val="0"/>
   </w:num>
   <w:num w:numId="61" w16cid:durableId="2038505990">
-    <w:abstractNumId w:val="111"/>
+    <w:abstractNumId w:val="114"/>
   </w:num>
   <w:num w:numId="62" w16cid:durableId="1149131574">
     <w:abstractNumId w:val="4"/>
   </w:num>
   <w:num w:numId="63" w16cid:durableId="906107397">
-    <w:abstractNumId w:val="94"/>
+    <w:abstractNumId w:val="97"/>
   </w:num>
   <w:num w:numId="64" w16cid:durableId="1939367359">
-    <w:abstractNumId w:val="68"/>
+    <w:abstractNumId w:val="70"/>
   </w:num>
   <w:num w:numId="65" w16cid:durableId="97801822">
-    <w:abstractNumId w:val="113"/>
+    <w:abstractNumId w:val="116"/>
   </w:num>
   <w:num w:numId="66" w16cid:durableId="926692919">
     <w:abstractNumId w:val="16"/>
   </w:num>
   <w:num w:numId="67" w16cid:durableId="243614529">
+    <w:abstractNumId w:val="157"/>
+  </w:num>
+  <w:num w:numId="68" w16cid:durableId="1445224447">
+    <w:abstractNumId w:val="67"/>
+  </w:num>
+  <w:num w:numId="69" w16cid:durableId="1218663837">
+    <w:abstractNumId w:val="53"/>
+  </w:num>
+  <w:num w:numId="70" w16cid:durableId="1103918135">
     <w:abstractNumId w:val="154"/>
   </w:num>
-  <w:num w:numId="68" w16cid:durableId="1445224447">
-    <w:abstractNumId w:val="65"/>
-  </w:num>
-  <w:num w:numId="69" w16cid:durableId="1218663837">
-    <w:abstractNumId w:val="51"/>
-  </w:num>
-  <w:num w:numId="70" w16cid:durableId="1103918135">
-    <w:abstractNumId w:val="151"/>
-  </w:num>
   <w:num w:numId="71" w16cid:durableId="468742549">
-    <w:abstractNumId w:val="73"/>
+    <w:abstractNumId w:val="76"/>
   </w:num>
   <w:num w:numId="72" w16cid:durableId="375857873">
-    <w:abstractNumId w:val="91"/>
+    <w:abstractNumId w:val="94"/>
   </w:num>
   <w:num w:numId="73" w16cid:durableId="1100301443">
-    <w:abstractNumId w:val="125"/>
+    <w:abstractNumId w:val="128"/>
   </w:num>
   <w:num w:numId="74" w16cid:durableId="1190725419">
-    <w:abstractNumId w:val="138"/>
+    <w:abstractNumId w:val="141"/>
   </w:num>
   <w:num w:numId="75" w16cid:durableId="1850368584">
-    <w:abstractNumId w:val="63"/>
+    <w:abstractNumId w:val="65"/>
   </w:num>
   <w:num w:numId="76" w16cid:durableId="226234949">
     <w:abstractNumId w:val="2"/>
   </w:num>
   <w:num w:numId="77" w16cid:durableId="679895937">
-    <w:abstractNumId w:val="121"/>
+    <w:abstractNumId w:val="124"/>
   </w:num>
   <w:num w:numId="78" w16cid:durableId="1622687106">
     <w:abstractNumId w:val="22"/>
@@ -24547,67 +24983,67 @@
     <w:abstractNumId w:val="33"/>
   </w:num>
   <w:num w:numId="80" w16cid:durableId="134837641">
-    <w:abstractNumId w:val="159"/>
+    <w:abstractNumId w:val="162"/>
   </w:num>
   <w:num w:numId="81" w16cid:durableId="1564869137">
-    <w:abstractNumId w:val="60"/>
+    <w:abstractNumId w:val="62"/>
   </w:num>
   <w:num w:numId="82" w16cid:durableId="29186647">
-    <w:abstractNumId w:val="114"/>
+    <w:abstractNumId w:val="117"/>
   </w:num>
   <w:num w:numId="83" w16cid:durableId="1135178494">
-    <w:abstractNumId w:val="54"/>
+    <w:abstractNumId w:val="56"/>
   </w:num>
   <w:num w:numId="84" w16cid:durableId="1000621534">
-    <w:abstractNumId w:val="88"/>
+    <w:abstractNumId w:val="91"/>
   </w:num>
   <w:num w:numId="85" w16cid:durableId="829903222">
-    <w:abstractNumId w:val="90"/>
+    <w:abstractNumId w:val="93"/>
   </w:num>
   <w:num w:numId="86" w16cid:durableId="292563823">
-    <w:abstractNumId w:val="81"/>
+    <w:abstractNumId w:val="84"/>
   </w:num>
   <w:num w:numId="87" w16cid:durableId="1621456547">
-    <w:abstractNumId w:val="150"/>
+    <w:abstractNumId w:val="153"/>
   </w:num>
   <w:num w:numId="88" w16cid:durableId="1455099907">
     <w:abstractNumId w:val="46"/>
   </w:num>
   <w:num w:numId="89" w16cid:durableId="1940983192">
-    <w:abstractNumId w:val="135"/>
+    <w:abstractNumId w:val="138"/>
   </w:num>
   <w:num w:numId="90" w16cid:durableId="393771197">
-    <w:abstractNumId w:val="71"/>
+    <w:abstractNumId w:val="74"/>
   </w:num>
   <w:num w:numId="91" w16cid:durableId="140117539">
-    <w:abstractNumId w:val="131"/>
+    <w:abstractNumId w:val="134"/>
   </w:num>
   <w:num w:numId="92" w16cid:durableId="1944147274">
-    <w:abstractNumId w:val="78"/>
+    <w:abstractNumId w:val="81"/>
   </w:num>
   <w:num w:numId="93" w16cid:durableId="1319378867">
-    <w:abstractNumId w:val="118"/>
+    <w:abstractNumId w:val="121"/>
   </w:num>
   <w:num w:numId="94" w16cid:durableId="623459607">
-    <w:abstractNumId w:val="129"/>
+    <w:abstractNumId w:val="132"/>
   </w:num>
   <w:num w:numId="95" w16cid:durableId="437912827">
-    <w:abstractNumId w:val="109"/>
+    <w:abstractNumId w:val="112"/>
   </w:num>
   <w:num w:numId="96" w16cid:durableId="735472579">
-    <w:abstractNumId w:val="133"/>
+    <w:abstractNumId w:val="136"/>
   </w:num>
   <w:num w:numId="97" w16cid:durableId="947084308">
-    <w:abstractNumId w:val="87"/>
+    <w:abstractNumId w:val="90"/>
   </w:num>
   <w:num w:numId="98" w16cid:durableId="103233350">
-    <w:abstractNumId w:val="105"/>
+    <w:abstractNumId w:val="108"/>
   </w:num>
   <w:num w:numId="99" w16cid:durableId="1064186072">
-    <w:abstractNumId w:val="100"/>
+    <w:abstractNumId w:val="103"/>
   </w:num>
   <w:num w:numId="100" w16cid:durableId="607396779">
-    <w:abstractNumId w:val="163"/>
+    <w:abstractNumId w:val="166"/>
   </w:num>
   <w:num w:numId="101" w16cid:durableId="1274749340">
     <w:abstractNumId w:val="31"/>
@@ -24616,118 +25052,118 @@
     <w:abstractNumId w:val="44"/>
   </w:num>
   <w:num w:numId="103" w16cid:durableId="1945140907">
-    <w:abstractNumId w:val="96"/>
+    <w:abstractNumId w:val="99"/>
   </w:num>
   <w:num w:numId="104" w16cid:durableId="2128809070">
-    <w:abstractNumId w:val="148"/>
+    <w:abstractNumId w:val="151"/>
   </w:num>
   <w:num w:numId="105" w16cid:durableId="974020314">
     <w:abstractNumId w:val="34"/>
   </w:num>
   <w:num w:numId="106" w16cid:durableId="1673871519">
-    <w:abstractNumId w:val="93"/>
+    <w:abstractNumId w:val="96"/>
   </w:num>
   <w:num w:numId="107" w16cid:durableId="1030111714">
-    <w:abstractNumId w:val="157"/>
+    <w:abstractNumId w:val="160"/>
   </w:num>
   <w:num w:numId="108" w16cid:durableId="513225104">
-    <w:abstractNumId w:val="128"/>
+    <w:abstractNumId w:val="131"/>
   </w:num>
   <w:num w:numId="109" w16cid:durableId="461656703">
-    <w:abstractNumId w:val="62"/>
+    <w:abstractNumId w:val="64"/>
   </w:num>
   <w:num w:numId="110" w16cid:durableId="682898956">
     <w:abstractNumId w:val="29"/>
   </w:num>
   <w:num w:numId="111" w16cid:durableId="1613247730">
-    <w:abstractNumId w:val="123"/>
+    <w:abstractNumId w:val="126"/>
   </w:num>
   <w:num w:numId="112" w16cid:durableId="569998836">
-    <w:abstractNumId w:val="120"/>
+    <w:abstractNumId w:val="123"/>
   </w:num>
   <w:num w:numId="113" w16cid:durableId="1181897660">
     <w:abstractNumId w:val="17"/>
   </w:num>
   <w:num w:numId="114" w16cid:durableId="526913008">
-    <w:abstractNumId w:val="61"/>
+    <w:abstractNumId w:val="63"/>
   </w:num>
   <w:num w:numId="115" w16cid:durableId="783574055">
-    <w:abstractNumId w:val="124"/>
+    <w:abstractNumId w:val="127"/>
   </w:num>
   <w:num w:numId="116" w16cid:durableId="159392470">
-    <w:abstractNumId w:val="127"/>
+    <w:abstractNumId w:val="130"/>
   </w:num>
   <w:num w:numId="117" w16cid:durableId="929777760">
-    <w:abstractNumId w:val="146"/>
+    <w:abstractNumId w:val="149"/>
   </w:num>
   <w:num w:numId="118" w16cid:durableId="394360658">
+    <w:abstractNumId w:val="142"/>
+  </w:num>
+  <w:num w:numId="119" w16cid:durableId="1342004500">
+    <w:abstractNumId w:val="156"/>
+  </w:num>
+  <w:num w:numId="120" w16cid:durableId="2088189998">
     <w:abstractNumId w:val="139"/>
   </w:num>
-  <w:num w:numId="119" w16cid:durableId="1342004500">
-    <w:abstractNumId w:val="153"/>
-  </w:num>
-  <w:num w:numId="120" w16cid:durableId="2088189998">
-    <w:abstractNumId w:val="136"/>
-  </w:num>
   <w:num w:numId="121" w16cid:durableId="1131678274">
-    <w:abstractNumId w:val="80"/>
+    <w:abstractNumId w:val="83"/>
   </w:num>
   <w:num w:numId="122" w16cid:durableId="792211288">
-    <w:abstractNumId w:val="156"/>
+    <w:abstractNumId w:val="159"/>
   </w:num>
   <w:num w:numId="123" w16cid:durableId="689574492">
-    <w:abstractNumId w:val="75"/>
+    <w:abstractNumId w:val="78"/>
   </w:num>
   <w:num w:numId="124" w16cid:durableId="528223479">
-    <w:abstractNumId w:val="158"/>
+    <w:abstractNumId w:val="161"/>
   </w:num>
   <w:num w:numId="125" w16cid:durableId="1838375459">
-    <w:abstractNumId w:val="50"/>
+    <w:abstractNumId w:val="51"/>
   </w:num>
   <w:num w:numId="126" w16cid:durableId="2021657521">
-    <w:abstractNumId w:val="66"/>
+    <w:abstractNumId w:val="68"/>
   </w:num>
   <w:num w:numId="127" w16cid:durableId="894662789">
-    <w:abstractNumId w:val="76"/>
+    <w:abstractNumId w:val="79"/>
   </w:num>
   <w:num w:numId="128" w16cid:durableId="1371344823">
-    <w:abstractNumId w:val="144"/>
+    <w:abstractNumId w:val="147"/>
   </w:num>
   <w:num w:numId="129" w16cid:durableId="853376258">
     <w:abstractNumId w:val="20"/>
   </w:num>
   <w:num w:numId="130" w16cid:durableId="902762096">
-    <w:abstractNumId w:val="165"/>
+    <w:abstractNumId w:val="168"/>
   </w:num>
   <w:num w:numId="131" w16cid:durableId="1531995347">
-    <w:abstractNumId w:val="84"/>
+    <w:abstractNumId w:val="87"/>
   </w:num>
   <w:num w:numId="132" w16cid:durableId="1047795757">
-    <w:abstractNumId w:val="83"/>
+    <w:abstractNumId w:val="86"/>
   </w:num>
   <w:num w:numId="133" w16cid:durableId="736822352">
     <w:abstractNumId w:val="48"/>
   </w:num>
   <w:num w:numId="134" w16cid:durableId="619991029">
-    <w:abstractNumId w:val="85"/>
+    <w:abstractNumId w:val="88"/>
   </w:num>
   <w:num w:numId="135" w16cid:durableId="141773157">
     <w:abstractNumId w:val="7"/>
   </w:num>
   <w:num w:numId="136" w16cid:durableId="1171331014">
-    <w:abstractNumId w:val="132"/>
+    <w:abstractNumId w:val="135"/>
   </w:num>
   <w:num w:numId="137" w16cid:durableId="1392852378">
-    <w:abstractNumId w:val="108"/>
+    <w:abstractNumId w:val="111"/>
   </w:num>
   <w:num w:numId="138" w16cid:durableId="1317228286">
-    <w:abstractNumId w:val="122"/>
+    <w:abstractNumId w:val="125"/>
   </w:num>
   <w:num w:numId="139" w16cid:durableId="1105879231">
-    <w:abstractNumId w:val="110"/>
+    <w:abstractNumId w:val="113"/>
   </w:num>
   <w:num w:numId="140" w16cid:durableId="352417780">
-    <w:abstractNumId w:val="89"/>
+    <w:abstractNumId w:val="92"/>
   </w:num>
   <w:num w:numId="141" w16cid:durableId="1843162797">
     <w:abstractNumId w:val="10"/>
@@ -24736,43 +25172,43 @@
     <w:abstractNumId w:val="12"/>
   </w:num>
   <w:num w:numId="143" w16cid:durableId="1724865213">
-    <w:abstractNumId w:val="57"/>
+    <w:abstractNumId w:val="59"/>
   </w:num>
   <w:num w:numId="144" w16cid:durableId="1297755745">
-    <w:abstractNumId w:val="117"/>
+    <w:abstractNumId w:val="120"/>
   </w:num>
   <w:num w:numId="145" w16cid:durableId="145826928">
-    <w:abstractNumId w:val="52"/>
+    <w:abstractNumId w:val="54"/>
   </w:num>
   <w:num w:numId="146" w16cid:durableId="706947885">
-    <w:abstractNumId w:val="72"/>
+    <w:abstractNumId w:val="75"/>
   </w:num>
   <w:num w:numId="147" w16cid:durableId="1218974825">
-    <w:abstractNumId w:val="102"/>
+    <w:abstractNumId w:val="105"/>
   </w:num>
   <w:num w:numId="148" w16cid:durableId="324743409">
-    <w:abstractNumId w:val="155"/>
+    <w:abstractNumId w:val="158"/>
   </w:num>
   <w:num w:numId="149" w16cid:durableId="1082291806">
     <w:abstractNumId w:val="43"/>
   </w:num>
   <w:num w:numId="150" w16cid:durableId="1576696524">
-    <w:abstractNumId w:val="95"/>
+    <w:abstractNumId w:val="98"/>
   </w:num>
   <w:num w:numId="151" w16cid:durableId="2105493696">
-    <w:abstractNumId w:val="112"/>
+    <w:abstractNumId w:val="115"/>
   </w:num>
   <w:num w:numId="152" w16cid:durableId="673217276">
-    <w:abstractNumId w:val="53"/>
+    <w:abstractNumId w:val="55"/>
   </w:num>
   <w:num w:numId="153" w16cid:durableId="5064100">
-    <w:abstractNumId w:val="161"/>
+    <w:abstractNumId w:val="164"/>
   </w:num>
   <w:num w:numId="154" w16cid:durableId="1056507788">
     <w:abstractNumId w:val="40"/>
   </w:num>
   <w:num w:numId="155" w16cid:durableId="1602569142">
-    <w:abstractNumId w:val="56"/>
+    <w:abstractNumId w:val="58"/>
   </w:num>
   <w:num w:numId="156" w16cid:durableId="1597865843">
     <w:abstractNumId w:val="15"/>
@@ -24784,28 +25220,37 @@
     <w:abstractNumId w:val="36"/>
   </w:num>
   <w:num w:numId="159" w16cid:durableId="728579027">
-    <w:abstractNumId w:val="97"/>
+    <w:abstractNumId w:val="100"/>
   </w:num>
   <w:num w:numId="160" w16cid:durableId="1724408675">
-    <w:abstractNumId w:val="55"/>
+    <w:abstractNumId w:val="57"/>
   </w:num>
   <w:num w:numId="161" w16cid:durableId="972978038">
-    <w:abstractNumId w:val="141"/>
+    <w:abstractNumId w:val="144"/>
   </w:num>
   <w:num w:numId="162" w16cid:durableId="1497956441">
-    <w:abstractNumId w:val="101"/>
+    <w:abstractNumId w:val="104"/>
   </w:num>
   <w:num w:numId="163" w16cid:durableId="1612667389">
     <w:abstractNumId w:val="11"/>
   </w:num>
   <w:num w:numId="164" w16cid:durableId="2012679674">
-    <w:abstractNumId w:val="116"/>
+    <w:abstractNumId w:val="119"/>
   </w:num>
   <w:num w:numId="165" w16cid:durableId="1902134908">
     <w:abstractNumId w:val="23"/>
   </w:num>
   <w:num w:numId="166" w16cid:durableId="2105956026">
-    <w:abstractNumId w:val="64"/>
+    <w:abstractNumId w:val="66"/>
+  </w:num>
+  <w:num w:numId="167" w16cid:durableId="1890921543">
+    <w:abstractNumId w:val="50"/>
+  </w:num>
+  <w:num w:numId="168" w16cid:durableId="950359601">
+    <w:abstractNumId w:val="72"/>
+  </w:num>
+  <w:num w:numId="169" w16cid:durableId="620645542">
+    <w:abstractNumId w:val="52"/>
   </w:num>
   <w:numIdMacAtCleanup w:val="11"/>
 </w:numbering>
@@ -25441,7 +25886,6 @@
   <w:style w:type="character" w:default="1" w:styleId="DefaultParagraphFont">
     <w:name w:val="Default Paragraph Font"/>
     <w:uiPriority w:val="1"/>
-    <w:semiHidden/>
     <w:unhideWhenUsed/>
   </w:style>
   <w:style w:type="table" w:default="1" w:styleId="TableNormal">
@@ -26711,38 +27155,6 @@
 </file>
 
 <file path=customXml/item1.xml><?xml version="1.0" encoding="utf-8"?>
-<?mso-contentType ?>
-<FormTemplates xmlns="http://schemas.microsoft.com/sharepoint/v3/contenttype/forms">
-  <Display>DocumentLibraryForm</Display>
-  <Edit>DocumentLibraryForm</Edit>
-  <New>DocumentLibraryForm</New>
-</FormTemplates>
-</file>
-
-<file path=customXml/item2.xml><?xml version="1.0" encoding="utf-8"?>
-<p:properties xmlns:p="http://schemas.microsoft.com/office/2006/metadata/properties" xmlns:xsi="http://www.w3.org/2001/XMLSchema-instance" xmlns:pc="http://schemas.microsoft.com/office/infopath/2007/PartnerControls">
-  <documentManagement>
-    <_ip_UnifiedCompliancePolicyUIAction xmlns="http://schemas.microsoft.com/sharepoint/v3" xsi:nil="true"/>
-    <Image xmlns="71af3243-3dd4-4a8d-8c0d-dd76da1f02a5">
-      <Url xsi:nil="true"/>
-      <Description xsi:nil="true"/>
-    </Image>
-    <Status xmlns="71af3243-3dd4-4a8d-8c0d-dd76da1f02a5">Not started</Status>
-    <_ip_UnifiedCompliancePolicyProperties xmlns="http://schemas.microsoft.com/sharepoint/v3" xsi:nil="true"/>
-    <ImageTagsTaxHTField xmlns="71af3243-3dd4-4a8d-8c0d-dd76da1f02a5">
-      <Terms xmlns="http://schemas.microsoft.com/office/infopath/2007/PartnerControls"/>
-    </ImageTagsTaxHTField>
-    <TaxCatchAll xmlns="230e9df3-be65-4c73-a93b-d1236ebd677e" xsi:nil="true"/>
-    <MediaServiceKeyPoints xmlns="71af3243-3dd4-4a8d-8c0d-dd76da1f02a5" xsi:nil="true"/>
-  </documentManagement>
-</p:properties>
-</file>
-
-<file path=customXml/item3.xml><?xml version="1.0" encoding="utf-8"?>
-<b:Sources xmlns:b="http://schemas.openxmlformats.org/officeDocument/2006/bibliography" xmlns="http://schemas.openxmlformats.org/officeDocument/2006/bibliography" SelectedStyle="\APASixthEditionOfficeOnline.xsl" StyleName="APA" Version="6"/>
-</file>
-
-<file path=customXml/item4.xml><?xml version="1.0" encoding="utf-8"?>
 <ct:contentTypeSchema xmlns:ct="http://schemas.microsoft.com/office/2006/metadata/contentType" xmlns:ma="http://schemas.microsoft.com/office/2006/metadata/properties/metaAttributes" ct:_="" ma:_="" ma:contentTypeName="Document" ma:contentTypeID="0x01010079F111ED35F8CC479449609E8A0923A6" ma:contentTypeVersion="21" ma:contentTypeDescription="Create a new document." ma:contentTypeScope="" ma:versionID="64dfb1555687e0874b4304b796b5b0c7">
   <xsd:schema xmlns:xsd="http://www.w3.org/2001/XMLSchema" xmlns:xs="http://www.w3.org/2001/XMLSchema" xmlns:p="http://schemas.microsoft.com/office/2006/metadata/properties" xmlns:ns1="http://schemas.microsoft.com/sharepoint/v3" xmlns:ns2="71af3243-3dd4-4a8d-8c0d-dd76da1f02a5" xmlns:ns3="16c05727-aa75-4e4a-9b5f-8a80a1165891" xmlns:ns4="230e9df3-be65-4c73-a93b-d1236ebd677e" targetNamespace="http://schemas.microsoft.com/office/2006/metadata/properties" ma:root="true" ma:fieldsID="e6e4c555b5e194d05b7203de9c4567b3" ns1:_="" ns2:_="" ns3:_="" ns4:_="">
     <xsd:import namespace="http://schemas.microsoft.com/sharepoint/v3"/>
@@ -27024,35 +27436,39 @@
 </ct:contentTypeSchema>
 </file>
 
-<file path=customXml/itemProps1.xml><?xml version="1.0" encoding="utf-8"?>
-<ds:datastoreItem xmlns:ds="http://schemas.openxmlformats.org/officeDocument/2006/customXml" ds:itemID="{C03343B0-2E37-4E4D-9C2F-1BB515B811A5}">
-  <ds:schemaRefs>
-    <ds:schemaRef ds:uri="http://schemas.microsoft.com/sharepoint/v3/contenttype/forms"/>
-  </ds:schemaRefs>
-</ds:datastoreItem>
+<file path=customXml/item2.xml><?xml version="1.0" encoding="utf-8"?>
+<b:Sources xmlns:b="http://schemas.openxmlformats.org/officeDocument/2006/bibliography" xmlns="http://schemas.openxmlformats.org/officeDocument/2006/bibliography" SelectedStyle="\APASixthEditionOfficeOnline.xsl" StyleName="APA" Version="6"/>
 </file>
 
-<file path=customXml/itemProps2.xml><?xml version="1.0" encoding="utf-8"?>
-<ds:datastoreItem xmlns:ds="http://schemas.openxmlformats.org/officeDocument/2006/customXml" ds:itemID="{FC286A1A-83A9-49D0-AE61-B506130901B0}">
-  <ds:schemaRefs>
-    <ds:schemaRef ds:uri="http://schemas.microsoft.com/office/2006/metadata/properties"/>
-    <ds:schemaRef ds:uri="http://schemas.microsoft.com/office/infopath/2007/PartnerControls"/>
-    <ds:schemaRef ds:uri="http://schemas.microsoft.com/sharepoint/v3"/>
-    <ds:schemaRef ds:uri="71af3243-3dd4-4a8d-8c0d-dd76da1f02a5"/>
-    <ds:schemaRef ds:uri="230e9df3-be65-4c73-a93b-d1236ebd677e"/>
-  </ds:schemaRefs>
-</ds:datastoreItem>
+<file path=customXml/item3.xml><?xml version="1.0" encoding="utf-8"?>
+<p:properties xmlns:p="http://schemas.microsoft.com/office/2006/metadata/properties" xmlns:xsi="http://www.w3.org/2001/XMLSchema-instance" xmlns:pc="http://schemas.microsoft.com/office/infopath/2007/PartnerControls">
+  <documentManagement>
+    <_ip_UnifiedCompliancePolicyUIAction xmlns="http://schemas.microsoft.com/sharepoint/v3" xsi:nil="true"/>
+    <Image xmlns="71af3243-3dd4-4a8d-8c0d-dd76da1f02a5">
+      <Url xsi:nil="true"/>
+      <Description xsi:nil="true"/>
+    </Image>
+    <Status xmlns="71af3243-3dd4-4a8d-8c0d-dd76da1f02a5">Not started</Status>
+    <_ip_UnifiedCompliancePolicyProperties xmlns="http://schemas.microsoft.com/sharepoint/v3" xsi:nil="true"/>
+    <ImageTagsTaxHTField xmlns="71af3243-3dd4-4a8d-8c0d-dd76da1f02a5">
+      <Terms xmlns="http://schemas.microsoft.com/office/infopath/2007/PartnerControls"/>
+    </ImageTagsTaxHTField>
+    <TaxCatchAll xmlns="230e9df3-be65-4c73-a93b-d1236ebd677e" xsi:nil="true"/>
+    <MediaServiceKeyPoints xmlns="71af3243-3dd4-4a8d-8c0d-dd76da1f02a5" xsi:nil="true"/>
+  </documentManagement>
+</p:properties>
 </file>
 
-<file path=customXml/itemProps3.xml><?xml version="1.0" encoding="utf-8"?>
-<ds:datastoreItem xmlns:ds="http://schemas.openxmlformats.org/officeDocument/2006/customXml" ds:itemID="{829E4964-E492-4D5C-A41E-6548D1BBBCF3}">
-  <ds:schemaRefs>
-    <ds:schemaRef ds:uri="http://schemas.openxmlformats.org/officeDocument/2006/bibliography"/>
-  </ds:schemaRefs>
-</ds:datastoreItem>
+<file path=customXml/item4.xml><?xml version="1.0" encoding="utf-8"?>
+<?mso-contentType ?>
+<FormTemplates xmlns="http://schemas.microsoft.com/sharepoint/v3/contenttype/forms">
+  <Display>DocumentLibraryForm</Display>
+  <Edit>DocumentLibraryForm</Edit>
+  <New>DocumentLibraryForm</New>
+</FormTemplates>
 </file>
 
-<file path=customXml/itemProps4.xml><?xml version="1.0" encoding="utf-8"?>
+<file path=customXml/itemProps1.xml><?xml version="1.0" encoding="utf-8"?>
 <ds:datastoreItem xmlns:ds="http://schemas.openxmlformats.org/officeDocument/2006/customXml" ds:itemID="{33E373DB-C2F7-43F7-8BF2-130AFA1F2081}">
   <ds:schemaRefs>
     <ds:schemaRef ds:uri="http://schemas.microsoft.com/office/2006/metadata/contentType"/>
@@ -27071,4 +27487,32 @@
     <ds:schemaRef ds:uri="http://schemas.microsoft.com/internal/obd"/>
   </ds:schemaRefs>
 </ds:datastoreItem>
+</file>
+
+<file path=customXml/itemProps2.xml><?xml version="1.0" encoding="utf-8"?>
+<ds:datastoreItem xmlns:ds="http://schemas.openxmlformats.org/officeDocument/2006/customXml" ds:itemID="{829E4964-E492-4D5C-A41E-6548D1BBBCF3}">
+  <ds:schemaRefs>
+    <ds:schemaRef ds:uri="http://schemas.openxmlformats.org/officeDocument/2006/bibliography"/>
+  </ds:schemaRefs>
+</ds:datastoreItem>
+</file>
+
+<file path=customXml/itemProps3.xml><?xml version="1.0" encoding="utf-8"?>
+<ds:datastoreItem xmlns:ds="http://schemas.openxmlformats.org/officeDocument/2006/customXml" ds:itemID="{FC286A1A-83A9-49D0-AE61-B506130901B0}">
+  <ds:schemaRefs>
+    <ds:schemaRef ds:uri="http://schemas.microsoft.com/office/2006/metadata/properties"/>
+    <ds:schemaRef ds:uri="http://schemas.microsoft.com/office/infopath/2007/PartnerControls"/>
+    <ds:schemaRef ds:uri="http://schemas.microsoft.com/sharepoint/v3"/>
+    <ds:schemaRef ds:uri="71af3243-3dd4-4a8d-8c0d-dd76da1f02a5"/>
+    <ds:schemaRef ds:uri="230e9df3-be65-4c73-a93b-d1236ebd677e"/>
+  </ds:schemaRefs>
+</ds:datastoreItem>
+</file>
+
+<file path=customXml/itemProps4.xml><?xml version="1.0" encoding="utf-8"?>
+<ds:datastoreItem xmlns:ds="http://schemas.openxmlformats.org/officeDocument/2006/customXml" ds:itemID="{C03343B0-2E37-4E4D-9C2F-1BB515B811A5}">
+  <ds:schemaRefs>
+    <ds:schemaRef ds:uri="http://schemas.microsoft.com/sharepoint/v3/contenttype/forms"/>
+  </ds:schemaRefs>
+</ds:datastoreItem>
 </file>
</xml_diff>